<commit_message>
Endorsements tax the additional premium on its own; sales pack, contracts and user manual
- Coverage-change endorsements: VAT, DST (P0.50 on each P4.00 or fraction) and LGT are charged on the additional
  or return premium with the policy's product and location, not as the difference of two rounded totals.
- Sales pack: client presentation, demo script, FAQ and objection handling, prospect e-mails, price book with
  packages and negotiation limits, ROI calculator, rate card, negotiation playbook (internal).
- Contract templates: MSA, perpetual licence, subscription, implementation SOW, change request procedure and form,
  maintenance and SLA, hosting and infrastructure, data processing agreement, NDA, order form, letter of award.
- User manual by persona (175 pages).
</commit_message>
<xml_diff>
--- a/docs/package/out/contracts/iNXT_BrokerVerse_Master_Services_Agreement.docx
+++ b/docs/package/out/contracts/iNXT_BrokerVerse_Master_Services_Agreement.docx
@@ -10,7 +10,7 @@
       <w:r>
         <w:rPr/>
         <w:drawing>
-          <wp:anchor behindDoc="1" distT="0" distB="0" distL="0" distR="0" simplePos="0" locked="0" layoutInCell="0" allowOverlap="1" relativeHeight="37">
+          <wp:anchor behindDoc="1" distT="0" distB="0" distL="0" distR="0" simplePos="0" locked="0" layoutInCell="0" allowOverlap="1" relativeHeight="28">
             <wp:simplePos x="0" y="0"/>
             <wp:positionH relativeFrom="margin">
               <wp:posOffset>-914400</wp:posOffset>
@@ -55,7 +55,7 @@
           </wp:anchor>
         </w:drawing>
         <w:drawing>
-          <wp:anchor behindDoc="1" distT="0" distB="0" distL="0" distR="0" simplePos="0" locked="0" layoutInCell="0" allowOverlap="1" relativeHeight="48">
+          <wp:anchor behindDoc="1" distT="0" distB="0" distL="0" distR="0" simplePos="0" locked="0" layoutInCell="0" allowOverlap="1" relativeHeight="39">
             <wp:simplePos x="0" y="0"/>
             <wp:positionH relativeFrom="margin">
               <wp:align>center</wp:align>
@@ -111,7 +111,7 @@
         <mc:AlternateContent>
           <mc:Choice Requires="wps">
             <w:drawing>
-              <wp:anchor behindDoc="0" distT="45720" distB="45720" distL="114300" distR="114300" simplePos="0" locked="0" layoutInCell="0" allowOverlap="1" relativeHeight="38" wp14:anchorId="3D43415C">
+              <wp:anchor behindDoc="0" distT="45720" distB="45720" distL="114300" distR="114300" simplePos="0" locked="0" layoutInCell="0" allowOverlap="1" relativeHeight="29" wp14:anchorId="3D43415C">
                 <wp:simplePos x="0" y="0"/>
                 <wp:positionH relativeFrom="page">
                   <wp:posOffset>194310</wp:posOffset>
@@ -226,7 +226,7 @@
         <mc:AlternateContent>
           <mc:Choice Requires="wps">
             <w:drawing>
-              <wp:anchor behindDoc="0" distT="45720" distB="45720" distL="113030" distR="114935" simplePos="0" locked="0" layoutInCell="0" allowOverlap="1" relativeHeight="40" wp14:anchorId="58C23128">
+              <wp:anchor behindDoc="0" distT="45720" distB="45720" distL="113030" distR="114935" simplePos="0" locked="0" layoutInCell="0" allowOverlap="1" relativeHeight="31" wp14:anchorId="58C23128">
                 <wp:simplePos x="0" y="0"/>
                 <wp:positionH relativeFrom="page">
                   <wp:posOffset>3094990</wp:posOffset>
@@ -341,7 +341,7 @@
         <mc:AlternateContent>
           <mc:Choice Requires="wps">
             <w:drawing>
-              <wp:anchor behindDoc="0" distT="45720" distB="45720" distL="114300" distR="113665" simplePos="0" locked="0" layoutInCell="0" allowOverlap="1" relativeHeight="42" wp14:anchorId="1BF25123">
+              <wp:anchor behindDoc="0" distT="45720" distB="45720" distL="114300" distR="113665" simplePos="0" locked="0" layoutInCell="0" allowOverlap="1" relativeHeight="33" wp14:anchorId="1BF25123">
                 <wp:simplePos x="0" y="0"/>
                 <wp:positionH relativeFrom="page">
                   <wp:posOffset>4992370</wp:posOffset>
@@ -456,7 +456,7 @@
         <mc:AlternateContent>
           <mc:Choice Requires="wps">
             <w:drawing>
-              <wp:anchor behindDoc="0" distT="45720" distB="46355" distL="114300" distR="114300" simplePos="0" locked="0" layoutInCell="0" allowOverlap="1" relativeHeight="44" wp14:anchorId="01DE2BF4">
+              <wp:anchor behindDoc="0" distT="45720" distB="46355" distL="114300" distR="114300" simplePos="0" locked="0" layoutInCell="0" allowOverlap="1" relativeHeight="35" wp14:anchorId="01DE2BF4">
                 <wp:simplePos x="0" y="0"/>
                 <wp:positionH relativeFrom="margin">
                   <wp:align>center</wp:align>
@@ -601,7 +601,7 @@
         <mc:AlternateContent>
           <mc:Choice Requires="wps">
             <w:drawing>
-              <wp:anchor behindDoc="0" distT="45720" distB="50800" distL="114300" distR="114300" simplePos="0" locked="0" layoutInCell="0" allowOverlap="1" relativeHeight="46" wp14:anchorId="204C02CC">
+              <wp:anchor behindDoc="0" distT="45720" distB="50800" distL="114300" distR="114300" simplePos="0" locked="0" layoutInCell="0" allowOverlap="1" relativeHeight="37" wp14:anchorId="204C02CC">
                 <wp:simplePos x="0" y="0"/>
                 <wp:positionH relativeFrom="margin">
                   <wp:align>center</wp:align>
@@ -789,7 +789,7 @@
             </w:rPr>
             <w:fldChar w:fldCharType="separate"/>
           </w:r>
-          <w:hyperlink w:anchor="__RefHeading___Toc1629_460044586">
+          <w:hyperlink w:anchor="__RefHeading___Toc3635_1603226370">
             <w:r>
               <w:rPr>
                 <w:webHidden/>
@@ -824,7 +824,7 @@
             </w:tabs>
             <w:rPr/>
           </w:pPr>
-          <w:hyperlink w:anchor="__RefHeading___Toc1631_460044586">
+          <w:hyperlink w:anchor="__RefHeading___Toc3637_1603226370">
             <w:r>
               <w:rPr>
                 <w:webHidden/>
@@ -853,7 +853,7 @@
             </w:tabs>
             <w:rPr/>
           </w:pPr>
-          <w:hyperlink w:anchor="__RefHeading___Toc1633_460044586">
+          <w:hyperlink w:anchor="__RefHeading___Toc3639_1603226370">
             <w:r>
               <w:rPr>
                 <w:webHidden/>
@@ -875,7 +875,7 @@
             </w:tabs>
             <w:rPr/>
           </w:pPr>
-          <w:hyperlink w:anchor="__RefHeading___Toc1635_460044586">
+          <w:hyperlink w:anchor="__RefHeading___Toc3641_1603226370">
             <w:r>
               <w:rPr>
                 <w:webHidden/>
@@ -897,7 +897,7 @@
             </w:tabs>
             <w:rPr/>
           </w:pPr>
-          <w:hyperlink w:anchor="__RefHeading___Toc1637_460044586">
+          <w:hyperlink w:anchor="__RefHeading___Toc3643_1603226370">
             <w:r>
               <w:rPr>
                 <w:webHidden/>
@@ -919,7 +919,7 @@
             </w:tabs>
             <w:rPr/>
           </w:pPr>
-          <w:hyperlink w:anchor="__RefHeading___Toc1639_460044586">
+          <w:hyperlink w:anchor="__RefHeading___Toc3645_1603226370">
             <w:r>
               <w:rPr>
                 <w:webHidden/>
@@ -941,7 +941,7 @@
             </w:tabs>
             <w:rPr/>
           </w:pPr>
-          <w:hyperlink w:anchor="__RefHeading___Toc1641_460044586">
+          <w:hyperlink w:anchor="__RefHeading___Toc3647_1603226370">
             <w:r>
               <w:rPr>
                 <w:webHidden/>
@@ -963,13 +963,13 @@
             </w:tabs>
             <w:rPr/>
           </w:pPr>
-          <w:hyperlink w:anchor="__RefHeading___Toc1643_460044586">
+          <w:hyperlink w:anchor="__RefHeading___Toc3649_1603226370">
             <w:r>
               <w:rPr>
                 <w:webHidden/>
                 <w:rStyle w:val="IndexLink"/>
               </w:rPr>
-              <w:t>6. Structure of the agreement</w:t>
+              <w:t>6. Services and responsibilities</w:t>
               <w:tab/>
               <w:t>9</w:t>
             </w:r>
@@ -985,13 +985,13 @@
             </w:tabs>
             <w:rPr/>
           </w:pPr>
-          <w:hyperlink w:anchor="__RefHeading___Toc1645_460044586">
+          <w:hyperlink w:anchor="__RefHeading___Toc3651_1603226370">
             <w:r>
               <w:rPr>
                 <w:webHidden/>
                 <w:rStyle w:val="IndexLink"/>
               </w:rPr>
-              <w:t>6.1 Order Forms</w:t>
+              <w:t>6.1 Structure of the agreement</w:t>
               <w:tab/>
               <w:t>9</w:t>
             </w:r>
@@ -1007,13 +1007,13 @@
             </w:tabs>
             <w:rPr/>
           </w:pPr>
-          <w:hyperlink w:anchor="__RefHeading___Toc1647_460044586">
+          <w:hyperlink w:anchor="__RefHeading___Toc3653_1603226370">
             <w:r>
               <w:rPr>
                 <w:webHidden/>
                 <w:rStyle w:val="IndexLink"/>
               </w:rPr>
-              <w:t>6.2 Order of precedence</w:t>
+              <w:t>6.2 Scope of services</w:t>
               <w:tab/>
               <w:t>9</w:t>
             </w:r>
@@ -1029,15 +1029,15 @@
             </w:tabs>
             <w:rPr/>
           </w:pPr>
-          <w:hyperlink w:anchor="__RefHeading___Toc1649_460044586">
+          <w:hyperlink w:anchor="__RefHeading___Toc3655_1603226370">
             <w:r>
               <w:rPr>
                 <w:webHidden/>
                 <w:rStyle w:val="IndexLink"/>
               </w:rPr>
-              <w:t>6.3 Affiliates</w:t>
+              <w:t>6.3 Client responsibilities</w:t>
               <w:tab/>
-              <w:t>9</w:t>
+              <w:t>10</w:t>
             </w:r>
           </w:hyperlink>
         </w:p>
@@ -1051,15 +1051,15 @@
             </w:tabs>
             <w:rPr/>
           </w:pPr>
-          <w:hyperlink w:anchor="__RefHeading___Toc1651_460044586">
+          <w:hyperlink w:anchor="__RefHeading___Toc3657_1603226370">
             <w:r>
               <w:rPr>
                 <w:webHidden/>
                 <w:rStyle w:val="IndexLink"/>
               </w:rPr>
-              <w:t>7. Services</w:t>
+              <w:t>7. Fees and taxes</w:t>
               <w:tab/>
-              <w:t>10</w:t>
+              <w:t>11</w:t>
             </w:r>
           </w:hyperlink>
         </w:p>
@@ -1073,15 +1073,15 @@
             </w:tabs>
             <w:rPr/>
           </w:pPr>
-          <w:hyperlink w:anchor="__RefHeading___Toc1653_460044586">
+          <w:hyperlink w:anchor="__RefHeading___Toc3659_1603226370">
             <w:r>
               <w:rPr>
                 <w:webHidden/>
                 <w:rStyle w:val="IndexLink"/>
               </w:rPr>
-              <w:t>7.1 Scope</w:t>
+              <w:t>7.1 Fees and payment</w:t>
               <w:tab/>
-              <w:t>10</w:t>
+              <w:t>11</w:t>
             </w:r>
           </w:hyperlink>
         </w:p>
@@ -1095,15 +1095,37 @@
             </w:tabs>
             <w:rPr/>
           </w:pPr>
-          <w:hyperlink w:anchor="__RefHeading___Toc1655_460044586">
+          <w:hyperlink w:anchor="__RefHeading___Toc3661_1603226370">
             <w:r>
               <w:rPr>
                 <w:webHidden/>
                 <w:rStyle w:val="IndexLink"/>
               </w:rPr>
-              <w:t>7.2 Personnel</w:t>
+              <w:t>7.2 Taxes</w:t>
               <w:tab/>
-              <w:t>10</w:t>
+              <w:t>11</w:t>
+            </w:r>
+          </w:hyperlink>
+        </w:p>
+        <w:p>
+          <w:pPr>
+            <w:pStyle w:val="TOC1"/>
+            <w:tabs>
+              <w:tab w:val="clear" w:pos="900"/>
+              <w:tab w:val="clear" w:pos="9350"/>
+              <w:tab w:val="right" w:pos="9025" w:leader="dot"/>
+            </w:tabs>
+            <w:rPr/>
+          </w:pPr>
+          <w:hyperlink w:anchor="__RefHeading___Toc3663_1603226370">
+            <w:r>
+              <w:rPr>
+                <w:webHidden/>
+                <w:rStyle w:val="IndexLink"/>
+              </w:rPr>
+              <w:t>8. Term and termination</w:t>
+              <w:tab/>
+              <w:t>13</w:t>
             </w:r>
           </w:hyperlink>
         </w:p>
@@ -1117,15 +1139,15 @@
             </w:tabs>
             <w:rPr/>
           </w:pPr>
-          <w:hyperlink w:anchor="__RefHeading___Toc1657_460044586">
+          <w:hyperlink w:anchor="__RefHeading___Toc3665_1603226370">
             <w:r>
               <w:rPr>
                 <w:webHidden/>
                 <w:rStyle w:val="IndexLink"/>
               </w:rPr>
-              <w:t>7.3 Subcontractors</w:t>
+              <w:t>8.1 Term</w:t>
               <w:tab/>
-              <w:t>10</w:t>
+              <w:t>13</w:t>
             </w:r>
           </w:hyperlink>
         </w:p>
@@ -1139,15 +1161,59 @@
             </w:tabs>
             <w:rPr/>
           </w:pPr>
-          <w:hyperlink w:anchor="__RefHeading___Toc1659_460044586">
+          <w:hyperlink w:anchor="__RefHeading___Toc3667_1603226370">
             <w:r>
               <w:rPr>
                 <w:webHidden/>
                 <w:rStyle w:val="IndexLink"/>
               </w:rPr>
-              <w:t>7.4 Change control</w:t>
+              <w:t>8.2 Termination for cause</w:t>
               <w:tab/>
-              <w:t>10</w:t>
+              <w:t>13</w:t>
+            </w:r>
+          </w:hyperlink>
+        </w:p>
+        <w:p>
+          <w:pPr>
+            <w:pStyle w:val="TOC2"/>
+            <w:tabs>
+              <w:tab w:val="clear" w:pos="900"/>
+              <w:tab w:val="clear" w:pos="9350"/>
+              <w:tab w:val="right" w:pos="9025" w:leader="dot"/>
+            </w:tabs>
+            <w:rPr/>
+          </w:pPr>
+          <w:hyperlink w:anchor="__RefHeading___Toc3669_1603226370">
+            <w:r>
+              <w:rPr>
+                <w:webHidden/>
+                <w:rStyle w:val="IndexLink"/>
+              </w:rPr>
+              <w:t>8.3 Termination for convenience</w:t>
+              <w:tab/>
+              <w:t>13</w:t>
+            </w:r>
+          </w:hyperlink>
+        </w:p>
+        <w:p>
+          <w:pPr>
+            <w:pStyle w:val="TOC2"/>
+            <w:tabs>
+              <w:tab w:val="clear" w:pos="900"/>
+              <w:tab w:val="clear" w:pos="9350"/>
+              <w:tab w:val="right" w:pos="9025" w:leader="dot"/>
+            </w:tabs>
+            <w:rPr/>
+          </w:pPr>
+          <w:hyperlink w:anchor="__RefHeading___Toc3671_1603226370">
+            <w:r>
+              <w:rPr>
+                <w:webHidden/>
+                <w:rStyle w:val="IndexLink"/>
+              </w:rPr>
+              <w:t>8.4 Effect of termination</w:t>
+              <w:tab/>
+              <w:t>13</w:t>
             </w:r>
           </w:hyperlink>
         </w:p>
@@ -1161,15 +1227,103 @@
             </w:tabs>
             <w:rPr/>
           </w:pPr>
-          <w:hyperlink w:anchor="__RefHeading___Toc1661_460044586">
+          <w:hyperlink w:anchor="__RefHeading___Toc3673_1603226370">
             <w:r>
               <w:rPr>
                 <w:webHidden/>
                 <w:rStyle w:val="IndexLink"/>
               </w:rPr>
-              <w:t>8. Client responsibilities</w:t>
+              <w:t>9. Rights in the platform and in data</w:t>
               <w:tab/>
-              <w:t>11</w:t>
+              <w:t>14</w:t>
+            </w:r>
+          </w:hyperlink>
+        </w:p>
+        <w:p>
+          <w:pPr>
+            <w:pStyle w:val="TOC2"/>
+            <w:tabs>
+              <w:tab w:val="clear" w:pos="900"/>
+              <w:tab w:val="clear" w:pos="9350"/>
+              <w:tab w:val="right" w:pos="9025" w:leader="dot"/>
+            </w:tabs>
+            <w:rPr/>
+          </w:pPr>
+          <w:hyperlink w:anchor="__RefHeading___Toc3675_1603226370">
+            <w:r>
+              <w:rPr>
+                <w:webHidden/>
+                <w:rStyle w:val="IndexLink"/>
+              </w:rPr>
+              <w:t>9.1 Intellectual property</w:t>
+              <w:tab/>
+              <w:t>14</w:t>
+            </w:r>
+          </w:hyperlink>
+        </w:p>
+        <w:p>
+          <w:pPr>
+            <w:pStyle w:val="TOC2"/>
+            <w:tabs>
+              <w:tab w:val="clear" w:pos="900"/>
+              <w:tab w:val="clear" w:pos="9350"/>
+              <w:tab w:val="right" w:pos="9025" w:leader="dot"/>
+            </w:tabs>
+            <w:rPr/>
+          </w:pPr>
+          <w:hyperlink w:anchor="__RefHeading___Toc3677_1603226370">
+            <w:r>
+              <w:rPr>
+                <w:webHidden/>
+                <w:rStyle w:val="IndexLink"/>
+              </w:rPr>
+              <w:t>9.2 Licence grant</w:t>
+              <w:tab/>
+              <w:t>14</w:t>
+            </w:r>
+          </w:hyperlink>
+        </w:p>
+        <w:p>
+          <w:pPr>
+            <w:pStyle w:val="TOC2"/>
+            <w:tabs>
+              <w:tab w:val="clear" w:pos="900"/>
+              <w:tab w:val="clear" w:pos="9350"/>
+              <w:tab w:val="right" w:pos="9025" w:leader="dot"/>
+            </w:tabs>
+            <w:rPr/>
+          </w:pPr>
+          <w:hyperlink w:anchor="__RefHeading___Toc3679_1603226370">
+            <w:r>
+              <w:rPr>
+                <w:webHidden/>
+                <w:rStyle w:val="IndexLink"/>
+              </w:rPr>
+              <w:t>9.3 Confidentiality</w:t>
+              <w:tab/>
+              <w:t>14</w:t>
+            </w:r>
+          </w:hyperlink>
+        </w:p>
+        <w:p>
+          <w:pPr>
+            <w:pStyle w:val="TOC2"/>
+            <w:tabs>
+              <w:tab w:val="clear" w:pos="900"/>
+              <w:tab w:val="clear" w:pos="9350"/>
+              <w:tab w:val="right" w:pos="9025" w:leader="dot"/>
+            </w:tabs>
+            <w:rPr/>
+          </w:pPr>
+          <w:hyperlink w:anchor="__RefHeading___Toc3681_1603226370">
+            <w:r>
+              <w:rPr>
+                <w:webHidden/>
+                <w:rStyle w:val="IndexLink"/>
+              </w:rPr>
+              <w:t>9.4 Data protection</w:t>
+              <w:tab/>
+              <w:t>15</w:t>
             </w:r>
           </w:hyperlink>
         </w:p>
@@ -1183,15 +1337,15 @@
             </w:tabs>
             <w:rPr/>
           </w:pPr>
-          <w:hyperlink w:anchor="__RefHeading___Toc1663_460044586">
+          <w:hyperlink w:anchor="__RefHeading___Toc3683_1603226370">
             <w:r>
               <w:rPr>
                 <w:webHidden/>
                 <w:rStyle w:val="IndexLink"/>
               </w:rPr>
-              <w:t>9. Fees and payment</w:t>
+              <w:t>10. Warranties, liability and indemnities</w:t>
               <w:tab/>
-              <w:t>12</w:t>
+              <w:t>16</w:t>
             </w:r>
           </w:hyperlink>
         </w:p>
@@ -1205,15 +1359,15 @@
             </w:tabs>
             <w:rPr/>
           </w:pPr>
-          <w:hyperlink w:anchor="__RefHeading___Toc1665_460044586">
+          <w:hyperlink w:anchor="__RefHeading___Toc3685_1603226370">
             <w:r>
               <w:rPr>
                 <w:webHidden/>
                 <w:rStyle w:val="IndexLink"/>
               </w:rPr>
-              <w:t>9.1 Fees</w:t>
+              <w:t>10.1 Warranties</w:t>
               <w:tab/>
-              <w:t>12</w:t>
+              <w:t>16</w:t>
             </w:r>
           </w:hyperlink>
         </w:p>
@@ -1227,15 +1381,37 @@
             </w:tabs>
             <w:rPr/>
           </w:pPr>
-          <w:hyperlink w:anchor="__RefHeading___Toc1667_460044586">
+          <w:hyperlink w:anchor="__RefHeading___Toc3687_1603226370">
             <w:r>
               <w:rPr>
                 <w:webHidden/>
                 <w:rStyle w:val="IndexLink"/>
               </w:rPr>
-              <w:t>9.2 Invoicing and payment</w:t>
+              <w:t>10.2 Limitation of liability</w:t>
               <w:tab/>
-              <w:t>12</w:t>
+              <w:t>16</w:t>
+            </w:r>
+          </w:hyperlink>
+        </w:p>
+        <w:p>
+          <w:pPr>
+            <w:pStyle w:val="TOC2"/>
+            <w:tabs>
+              <w:tab w:val="clear" w:pos="900"/>
+              <w:tab w:val="clear" w:pos="9350"/>
+              <w:tab w:val="right" w:pos="9025" w:leader="dot"/>
+            </w:tabs>
+            <w:rPr/>
+          </w:pPr>
+          <w:hyperlink w:anchor="__RefHeading___Toc3689_1603226370">
+            <w:r>
+              <w:rPr>
+                <w:webHidden/>
+                <w:rStyle w:val="IndexLink"/>
+              </w:rPr>
+              <w:t>10.3 Indemnities</w:t>
+              <w:tab/>
+              <w:t>17</w:t>
             </w:r>
           </w:hyperlink>
         </w:p>
@@ -1249,15 +1425,15 @@
             </w:tabs>
             <w:rPr/>
           </w:pPr>
-          <w:hyperlink w:anchor="__RefHeading___Toc1669_460044586">
+          <w:hyperlink w:anchor="__RefHeading___Toc3691_1603226370">
             <w:r>
               <w:rPr>
                 <w:webHidden/>
                 <w:rStyle w:val="IndexLink"/>
               </w:rPr>
-              <w:t>10. Taxes</w:t>
+              <w:t>11. Other terms</w:t>
               <w:tab/>
-              <w:t>13</w:t>
+              <w:t>18</w:t>
             </w:r>
           </w:hyperlink>
         </w:p>
@@ -1271,15 +1447,15 @@
             </w:tabs>
             <w:rPr/>
           </w:pPr>
-          <w:hyperlink w:anchor="__RefHeading___Toc1671_460044586">
+          <w:hyperlink w:anchor="__RefHeading___Toc3693_1603226370">
             <w:r>
               <w:rPr>
                 <w:webHidden/>
                 <w:rStyle w:val="IndexLink"/>
               </w:rPr>
-              <w:t>10.1 VAT</w:t>
+              <w:t>11.1 Force majeure</w:t>
               <w:tab/>
-              <w:t>13</w:t>
+              <w:t>18</w:t>
             </w:r>
           </w:hyperlink>
         </w:p>
@@ -1293,15 +1469,15 @@
             </w:tabs>
             <w:rPr/>
           </w:pPr>
-          <w:hyperlink w:anchor="__RefHeading___Toc1673_460044586">
+          <w:hyperlink w:anchor="__RefHeading___Toc3695_1603226370">
             <w:r>
               <w:rPr>
                 <w:webHidden/>
                 <w:rStyle w:val="IndexLink"/>
               </w:rPr>
-              <w:t>10.2 Withholding taxes</w:t>
+              <w:t>11.2 Non-solicitation</w:t>
               <w:tab/>
-              <w:t>13</w:t>
+              <w:t>18</w:t>
             </w:r>
           </w:hyperlink>
         </w:p>
@@ -1315,15 +1491,103 @@
             </w:tabs>
             <w:rPr/>
           </w:pPr>
-          <w:hyperlink w:anchor="__RefHeading___Toc1675_460044586">
+          <w:hyperlink w:anchor="__RefHeading___Toc3697_1603226370">
             <w:r>
               <w:rPr>
                 <w:webHidden/>
                 <w:rStyle w:val="IndexLink"/>
               </w:rPr>
-              <w:t>10.3 Other taxes</w:t>
+              <w:t>11.3 Assignment and subcontracting</w:t>
               <w:tab/>
-              <w:t>13</w:t>
+              <w:t>18</w:t>
+            </w:r>
+          </w:hyperlink>
+        </w:p>
+        <w:p>
+          <w:pPr>
+            <w:pStyle w:val="TOC2"/>
+            <w:tabs>
+              <w:tab w:val="clear" w:pos="900"/>
+              <w:tab w:val="clear" w:pos="9350"/>
+              <w:tab w:val="right" w:pos="9025" w:leader="dot"/>
+            </w:tabs>
+            <w:rPr/>
+          </w:pPr>
+          <w:hyperlink w:anchor="__RefHeading___Toc3699_1603226370">
+            <w:r>
+              <w:rPr>
+                <w:webHidden/>
+                <w:rStyle w:val="IndexLink"/>
+              </w:rPr>
+              <w:t>11.4 Dispute resolution</w:t>
+              <w:tab/>
+              <w:t>18</w:t>
+            </w:r>
+          </w:hyperlink>
+        </w:p>
+        <w:p>
+          <w:pPr>
+            <w:pStyle w:val="TOC2"/>
+            <w:tabs>
+              <w:tab w:val="clear" w:pos="900"/>
+              <w:tab w:val="clear" w:pos="9350"/>
+              <w:tab w:val="right" w:pos="9025" w:leader="dot"/>
+            </w:tabs>
+            <w:rPr/>
+          </w:pPr>
+          <w:hyperlink w:anchor="__RefHeading___Toc3701_1603226370">
+            <w:r>
+              <w:rPr>
+                <w:webHidden/>
+                <w:rStyle w:val="IndexLink"/>
+              </w:rPr>
+              <w:t>11.5 Governing law</w:t>
+              <w:tab/>
+              <w:t>19</w:t>
+            </w:r>
+          </w:hyperlink>
+        </w:p>
+        <w:p>
+          <w:pPr>
+            <w:pStyle w:val="TOC2"/>
+            <w:tabs>
+              <w:tab w:val="clear" w:pos="900"/>
+              <w:tab w:val="clear" w:pos="9350"/>
+              <w:tab w:val="right" w:pos="9025" w:leader="dot"/>
+            </w:tabs>
+            <w:rPr/>
+          </w:pPr>
+          <w:hyperlink w:anchor="__RefHeading___Toc3703_1603226370">
+            <w:r>
+              <w:rPr>
+                <w:webHidden/>
+                <w:rStyle w:val="IndexLink"/>
+              </w:rPr>
+              <w:t>11.6 Notices</w:t>
+              <w:tab/>
+              <w:t>19</w:t>
+            </w:r>
+          </w:hyperlink>
+        </w:p>
+        <w:p>
+          <w:pPr>
+            <w:pStyle w:val="TOC2"/>
+            <w:tabs>
+              <w:tab w:val="clear" w:pos="900"/>
+              <w:tab w:val="clear" w:pos="9350"/>
+              <w:tab w:val="right" w:pos="9025" w:leader="dot"/>
+            </w:tabs>
+            <w:rPr/>
+          </w:pPr>
+          <w:hyperlink w:anchor="__RefHeading___Toc3705_1603226370">
+            <w:r>
+              <w:rPr>
+                <w:webHidden/>
+                <w:rStyle w:val="IndexLink"/>
+              </w:rPr>
+              <w:t>11.7 General</w:t>
+              <w:tab/>
+              <w:t>19</w:t>
             </w:r>
           </w:hyperlink>
         </w:p>
@@ -1337,15 +1601,15 @@
             </w:tabs>
             <w:rPr/>
           </w:pPr>
-          <w:hyperlink w:anchor="__RefHeading___Toc1677_460044586">
+          <w:hyperlink w:anchor="__RefHeading___Toc3707_1603226370">
             <w:r>
               <w:rPr>
                 <w:webHidden/>
                 <w:rStyle w:val="IndexLink"/>
               </w:rPr>
-              <w:t>11. Term and termination</w:t>
+              <w:t>12. Signatures</w:t>
               <w:tab/>
-              <w:t>14</w:t>
+              <w:t>21</w:t>
             </w:r>
           </w:hyperlink>
         </w:p>
@@ -1359,15 +1623,15 @@
             </w:tabs>
             <w:rPr/>
           </w:pPr>
-          <w:hyperlink w:anchor="__RefHeading___Toc1679_460044586">
+          <w:hyperlink w:anchor="__RefHeading___Toc3709_1603226370">
             <w:r>
               <w:rPr>
                 <w:webHidden/>
                 <w:rStyle w:val="IndexLink"/>
               </w:rPr>
-              <w:t>11.1 Term</w:t>
+              <w:t>12.1 Signature blocks</w:t>
               <w:tab/>
-              <w:t>14</w:t>
+              <w:t>21</w:t>
             </w:r>
           </w:hyperlink>
         </w:p>
@@ -1381,59 +1645,15 @@
             </w:tabs>
             <w:rPr/>
           </w:pPr>
-          <w:hyperlink w:anchor="__RefHeading___Toc1681_460044586">
+          <w:hyperlink w:anchor="__RefHeading___Toc3711_1603226370">
             <w:r>
               <w:rPr>
                 <w:webHidden/>
                 <w:rStyle w:val="IndexLink"/>
               </w:rPr>
-              <w:t>11.2 Termination for cause</w:t>
+              <w:t>12.2 Acknowledgment</w:t>
               <w:tab/>
-              <w:t>14</w:t>
-            </w:r>
-          </w:hyperlink>
-        </w:p>
-        <w:p>
-          <w:pPr>
-            <w:pStyle w:val="TOC2"/>
-            <w:tabs>
-              <w:tab w:val="clear" w:pos="900"/>
-              <w:tab w:val="clear" w:pos="9350"/>
-              <w:tab w:val="right" w:pos="9025" w:leader="dot"/>
-            </w:tabs>
-            <w:rPr/>
-          </w:pPr>
-          <w:hyperlink w:anchor="__RefHeading___Toc1683_460044586">
-            <w:r>
-              <w:rPr>
-                <w:webHidden/>
-                <w:rStyle w:val="IndexLink"/>
-              </w:rPr>
-              <w:t>11.3 Termination for convenience</w:t>
-              <w:tab/>
-              <w:t>14</w:t>
-            </w:r>
-          </w:hyperlink>
-        </w:p>
-        <w:p>
-          <w:pPr>
-            <w:pStyle w:val="TOC2"/>
-            <w:tabs>
-              <w:tab w:val="clear" w:pos="900"/>
-              <w:tab w:val="clear" w:pos="9350"/>
-              <w:tab w:val="right" w:pos="9025" w:leader="dot"/>
-            </w:tabs>
-            <w:rPr/>
-          </w:pPr>
-          <w:hyperlink w:anchor="__RefHeading___Toc1685_460044586">
-            <w:r>
-              <w:rPr>
-                <w:webHidden/>
-                <w:rStyle w:val="IndexLink"/>
-              </w:rPr>
-              <w:t>11.4 Effect of termination</w:t>
-              <w:tab/>
-              <w:t>14</w:t>
+              <w:t>21</w:t>
             </w:r>
           </w:hyperlink>
         </w:p>
@@ -1447,81 +1667,15 @@
             </w:tabs>
             <w:rPr/>
           </w:pPr>
-          <w:hyperlink w:anchor="__RefHeading___Toc1687_460044586">
+          <w:hyperlink w:anchor="__RefHeading___Toc3713_1603226370">
             <w:r>
               <w:rPr>
                 <w:webHidden/>
                 <w:rStyle w:val="IndexLink"/>
               </w:rPr>
-              <w:t>12. Intellectual property</w:t>
+              <w:t>13. Annex A: schedules and forms</w:t>
               <w:tab/>
-              <w:t>15</w:t>
-            </w:r>
-          </w:hyperlink>
-        </w:p>
-        <w:p>
-          <w:pPr>
-            <w:pStyle w:val="TOC2"/>
-            <w:tabs>
-              <w:tab w:val="clear" w:pos="900"/>
-              <w:tab w:val="clear" w:pos="9350"/>
-              <w:tab w:val="right" w:pos="9025" w:leader="dot"/>
-            </w:tabs>
-            <w:rPr/>
-          </w:pPr>
-          <w:hyperlink w:anchor="__RefHeading___Toc1689_460044586">
-            <w:r>
-              <w:rPr>
-                <w:webHidden/>
-                <w:rStyle w:val="IndexLink"/>
-              </w:rPr>
-              <w:t>12.1 Platform</w:t>
-              <w:tab/>
-              <w:t>15</w:t>
-            </w:r>
-          </w:hyperlink>
-        </w:p>
-        <w:p>
-          <w:pPr>
-            <w:pStyle w:val="TOC2"/>
-            <w:tabs>
-              <w:tab w:val="clear" w:pos="900"/>
-              <w:tab w:val="clear" w:pos="9350"/>
-              <w:tab w:val="right" w:pos="9025" w:leader="dot"/>
-            </w:tabs>
-            <w:rPr/>
-          </w:pPr>
-          <w:hyperlink w:anchor="__RefHeading___Toc1691_460044586">
-            <w:r>
-              <w:rPr>
-                <w:webHidden/>
-                <w:rStyle w:val="IndexLink"/>
-              </w:rPr>
-              <w:t>12.2 Client Data</w:t>
-              <w:tab/>
-              <w:t>15</w:t>
-            </w:r>
-          </w:hyperlink>
-        </w:p>
-        <w:p>
-          <w:pPr>
-            <w:pStyle w:val="TOC2"/>
-            <w:tabs>
-              <w:tab w:val="clear" w:pos="900"/>
-              <w:tab w:val="clear" w:pos="9350"/>
-              <w:tab w:val="right" w:pos="9025" w:leader="dot"/>
-            </w:tabs>
-            <w:rPr/>
-          </w:pPr>
-          <w:hyperlink w:anchor="__RefHeading___Toc1693_460044586">
-            <w:r>
-              <w:rPr>
-                <w:webHidden/>
-                <w:rStyle w:val="IndexLink"/>
-              </w:rPr>
-              <w:t>12.3 Feedback and statistics</w:t>
-              <w:tab/>
-              <w:t>15</w:t>
+              <w:t>22</w:t>
             </w:r>
           </w:hyperlink>
         </w:p>
@@ -1535,711 +1689,7 @@
             </w:tabs>
             <w:rPr/>
           </w:pPr>
-          <w:hyperlink w:anchor="__RefHeading___Toc1695_460044586">
-            <w:r>
-              <w:rPr>
-                <w:webHidden/>
-                <w:rStyle w:val="IndexLink"/>
-              </w:rPr>
-              <w:t>13. Licence grant</w:t>
-              <w:tab/>
-              <w:t>16</w:t>
-            </w:r>
-          </w:hyperlink>
-        </w:p>
-        <w:p>
-          <w:pPr>
-            <w:pStyle w:val="TOC1"/>
-            <w:tabs>
-              <w:tab w:val="clear" w:pos="900"/>
-              <w:tab w:val="clear" w:pos="9350"/>
-              <w:tab w:val="right" w:pos="9025" w:leader="dot"/>
-            </w:tabs>
-            <w:rPr/>
-          </w:pPr>
-          <w:hyperlink w:anchor="__RefHeading___Toc1697_460044586">
-            <w:r>
-              <w:rPr>
-                <w:webHidden/>
-                <w:rStyle w:val="IndexLink"/>
-              </w:rPr>
-              <w:t>14. Confidentiality</w:t>
-              <w:tab/>
-              <w:t>17</w:t>
-            </w:r>
-          </w:hyperlink>
-        </w:p>
-        <w:p>
-          <w:pPr>
-            <w:pStyle w:val="TOC2"/>
-            <w:tabs>
-              <w:tab w:val="clear" w:pos="900"/>
-              <w:tab w:val="clear" w:pos="9350"/>
-              <w:tab w:val="right" w:pos="9025" w:leader="dot"/>
-            </w:tabs>
-            <w:rPr/>
-          </w:pPr>
-          <w:hyperlink w:anchor="__RefHeading___Toc1699_460044586">
-            <w:r>
-              <w:rPr>
-                <w:webHidden/>
-                <w:rStyle w:val="IndexLink"/>
-              </w:rPr>
-              <w:t>14.1 Confidential Information</w:t>
-              <w:tab/>
-              <w:t>17</w:t>
-            </w:r>
-          </w:hyperlink>
-        </w:p>
-        <w:p>
-          <w:pPr>
-            <w:pStyle w:val="TOC2"/>
-            <w:tabs>
-              <w:tab w:val="clear" w:pos="900"/>
-              <w:tab w:val="clear" w:pos="9350"/>
-              <w:tab w:val="right" w:pos="9025" w:leader="dot"/>
-            </w:tabs>
-            <w:rPr/>
-          </w:pPr>
-          <w:hyperlink w:anchor="__RefHeading___Toc1701_460044586">
-            <w:r>
-              <w:rPr>
-                <w:webHidden/>
-                <w:rStyle w:val="IndexLink"/>
-              </w:rPr>
-              <w:t>14.2 Obligations</w:t>
-              <w:tab/>
-              <w:t>17</w:t>
-            </w:r>
-          </w:hyperlink>
-        </w:p>
-        <w:p>
-          <w:pPr>
-            <w:pStyle w:val="TOC2"/>
-            <w:tabs>
-              <w:tab w:val="clear" w:pos="900"/>
-              <w:tab w:val="clear" w:pos="9350"/>
-              <w:tab w:val="right" w:pos="9025" w:leader="dot"/>
-            </w:tabs>
-            <w:rPr/>
-          </w:pPr>
-          <w:hyperlink w:anchor="__RefHeading___Toc1703_460044586">
-            <w:r>
-              <w:rPr>
-                <w:webHidden/>
-                <w:rStyle w:val="IndexLink"/>
-              </w:rPr>
-              <w:t>14.3 Exceptions</w:t>
-              <w:tab/>
-              <w:t>17</w:t>
-            </w:r>
-          </w:hyperlink>
-        </w:p>
-        <w:p>
-          <w:pPr>
-            <w:pStyle w:val="TOC2"/>
-            <w:tabs>
-              <w:tab w:val="clear" w:pos="900"/>
-              <w:tab w:val="clear" w:pos="9350"/>
-              <w:tab w:val="right" w:pos="9025" w:leader="dot"/>
-            </w:tabs>
-            <w:rPr/>
-          </w:pPr>
-          <w:hyperlink w:anchor="__RefHeading___Toc1705_460044586">
-            <w:r>
-              <w:rPr>
-                <w:webHidden/>
-                <w:rStyle w:val="IndexLink"/>
-              </w:rPr>
-              <w:t>14.4 Duration</w:t>
-              <w:tab/>
-              <w:t>17</w:t>
-            </w:r>
-          </w:hyperlink>
-        </w:p>
-        <w:p>
-          <w:pPr>
-            <w:pStyle w:val="TOC1"/>
-            <w:tabs>
-              <w:tab w:val="clear" w:pos="900"/>
-              <w:tab w:val="clear" w:pos="9350"/>
-              <w:tab w:val="right" w:pos="9025" w:leader="dot"/>
-            </w:tabs>
-            <w:rPr/>
-          </w:pPr>
-          <w:hyperlink w:anchor="__RefHeading___Toc1707_460044586">
-            <w:r>
-              <w:rPr>
-                <w:webHidden/>
-                <w:rStyle w:val="IndexLink"/>
-              </w:rPr>
-              <w:t>15. Data protection</w:t>
-              <w:tab/>
-              <w:t>18</w:t>
-            </w:r>
-          </w:hyperlink>
-        </w:p>
-        <w:p>
-          <w:pPr>
-            <w:pStyle w:val="TOC1"/>
-            <w:tabs>
-              <w:tab w:val="clear" w:pos="900"/>
-              <w:tab w:val="clear" w:pos="9350"/>
-              <w:tab w:val="right" w:pos="9025" w:leader="dot"/>
-            </w:tabs>
-            <w:rPr/>
-          </w:pPr>
-          <w:hyperlink w:anchor="__RefHeading___Toc1709_460044586">
-            <w:r>
-              <w:rPr>
-                <w:webHidden/>
-                <w:rStyle w:val="IndexLink"/>
-              </w:rPr>
-              <w:t>16. Warranties</w:t>
-              <w:tab/>
-              <w:t>19</w:t>
-            </w:r>
-          </w:hyperlink>
-        </w:p>
-        <w:p>
-          <w:pPr>
-            <w:pStyle w:val="TOC2"/>
-            <w:tabs>
-              <w:tab w:val="clear" w:pos="900"/>
-              <w:tab w:val="clear" w:pos="9350"/>
-              <w:tab w:val="right" w:pos="9025" w:leader="dot"/>
-            </w:tabs>
-            <w:rPr/>
-          </w:pPr>
-          <w:hyperlink w:anchor="__RefHeading___Toc1711_460044586">
-            <w:r>
-              <w:rPr>
-                <w:webHidden/>
-                <w:rStyle w:val="IndexLink"/>
-              </w:rPr>
-              <w:t>16.1 Mutual warranties</w:t>
-              <w:tab/>
-              <w:t>19</w:t>
-            </w:r>
-          </w:hyperlink>
-        </w:p>
-        <w:p>
-          <w:pPr>
-            <w:pStyle w:val="TOC2"/>
-            <w:tabs>
-              <w:tab w:val="clear" w:pos="900"/>
-              <w:tab w:val="clear" w:pos="9350"/>
-              <w:tab w:val="right" w:pos="9025" w:leader="dot"/>
-            </w:tabs>
-            <w:rPr/>
-          </w:pPr>
-          <w:hyperlink w:anchor="__RefHeading___Toc1713_460044586">
-            <w:r>
-              <w:rPr>
-                <w:webHidden/>
-                <w:rStyle w:val="IndexLink"/>
-              </w:rPr>
-              <w:t>16.2 iorta TechNXT warranties</w:t>
-              <w:tab/>
-              <w:t>19</w:t>
-            </w:r>
-          </w:hyperlink>
-        </w:p>
-        <w:p>
-          <w:pPr>
-            <w:pStyle w:val="TOC2"/>
-            <w:tabs>
-              <w:tab w:val="clear" w:pos="900"/>
-              <w:tab w:val="clear" w:pos="9350"/>
-              <w:tab w:val="right" w:pos="9025" w:leader="dot"/>
-            </w:tabs>
-            <w:rPr/>
-          </w:pPr>
-          <w:hyperlink w:anchor="__RefHeading___Toc1715_460044586">
-            <w:r>
-              <w:rPr>
-                <w:webHidden/>
-                <w:rStyle w:val="IndexLink"/>
-              </w:rPr>
-              <w:t>16.3 Remedies</w:t>
-              <w:tab/>
-              <w:t>19</w:t>
-            </w:r>
-          </w:hyperlink>
-        </w:p>
-        <w:p>
-          <w:pPr>
-            <w:pStyle w:val="TOC2"/>
-            <w:tabs>
-              <w:tab w:val="clear" w:pos="900"/>
-              <w:tab w:val="clear" w:pos="9350"/>
-              <w:tab w:val="right" w:pos="9025" w:leader="dot"/>
-            </w:tabs>
-            <w:rPr/>
-          </w:pPr>
-          <w:hyperlink w:anchor="__RefHeading___Toc1717_460044586">
-            <w:r>
-              <w:rPr>
-                <w:webHidden/>
-                <w:rStyle w:val="IndexLink"/>
-              </w:rPr>
-              <w:t>16.4 Exclusions</w:t>
-              <w:tab/>
-              <w:t>19</w:t>
-            </w:r>
-          </w:hyperlink>
-        </w:p>
-        <w:p>
-          <w:pPr>
-            <w:pStyle w:val="TOC2"/>
-            <w:tabs>
-              <w:tab w:val="clear" w:pos="900"/>
-              <w:tab w:val="clear" w:pos="9350"/>
-              <w:tab w:val="right" w:pos="9025" w:leader="dot"/>
-            </w:tabs>
-            <w:rPr/>
-          </w:pPr>
-          <w:hyperlink w:anchor="__RefHeading___Toc1719_460044586">
-            <w:r>
-              <w:rPr>
-                <w:webHidden/>
-                <w:rStyle w:val="IndexLink"/>
-              </w:rPr>
-              <w:t>16.5 Disclaimer</w:t>
-              <w:tab/>
-              <w:t>19</w:t>
-            </w:r>
-          </w:hyperlink>
-        </w:p>
-        <w:p>
-          <w:pPr>
-            <w:pStyle w:val="TOC1"/>
-            <w:tabs>
-              <w:tab w:val="clear" w:pos="900"/>
-              <w:tab w:val="clear" w:pos="9350"/>
-              <w:tab w:val="right" w:pos="9025" w:leader="dot"/>
-            </w:tabs>
-            <w:rPr/>
-          </w:pPr>
-          <w:hyperlink w:anchor="__RefHeading___Toc1721_460044586">
-            <w:r>
-              <w:rPr>
-                <w:webHidden/>
-                <w:rStyle w:val="IndexLink"/>
-              </w:rPr>
-              <w:t>17. Limitation of liability</w:t>
-              <w:tab/>
-              <w:t>20</w:t>
-            </w:r>
-          </w:hyperlink>
-        </w:p>
-        <w:p>
-          <w:pPr>
-            <w:pStyle w:val="TOC1"/>
-            <w:tabs>
-              <w:tab w:val="clear" w:pos="900"/>
-              <w:tab w:val="clear" w:pos="9350"/>
-              <w:tab w:val="right" w:pos="9025" w:leader="dot"/>
-            </w:tabs>
-            <w:rPr/>
-          </w:pPr>
-          <w:hyperlink w:anchor="__RefHeading___Toc1723_460044586">
-            <w:r>
-              <w:rPr>
-                <w:webHidden/>
-                <w:rStyle w:val="IndexLink"/>
-              </w:rPr>
-              <w:t>18. Indemnities</w:t>
-              <w:tab/>
-              <w:t>21</w:t>
-            </w:r>
-          </w:hyperlink>
-        </w:p>
-        <w:p>
-          <w:pPr>
-            <w:pStyle w:val="TOC2"/>
-            <w:tabs>
-              <w:tab w:val="clear" w:pos="900"/>
-              <w:tab w:val="clear" w:pos="9350"/>
-              <w:tab w:val="right" w:pos="9025" w:leader="dot"/>
-            </w:tabs>
-            <w:rPr/>
-          </w:pPr>
-          <w:hyperlink w:anchor="__RefHeading___Toc1725_460044586">
-            <w:r>
-              <w:rPr>
-                <w:webHidden/>
-                <w:rStyle w:val="IndexLink"/>
-              </w:rPr>
-              <w:t>18.1 Intellectual property indemnity</w:t>
-              <w:tab/>
-              <w:t>21</w:t>
-            </w:r>
-          </w:hyperlink>
-        </w:p>
-        <w:p>
-          <w:pPr>
-            <w:pStyle w:val="TOC2"/>
-            <w:tabs>
-              <w:tab w:val="clear" w:pos="900"/>
-              <w:tab w:val="clear" w:pos="9350"/>
-              <w:tab w:val="right" w:pos="9025" w:leader="dot"/>
-            </w:tabs>
-            <w:rPr/>
-          </w:pPr>
-          <w:hyperlink w:anchor="__RefHeading___Toc1727_460044586">
-            <w:r>
-              <w:rPr>
-                <w:webHidden/>
-                <w:rStyle w:val="IndexLink"/>
-              </w:rPr>
-              <w:t>18.2 Client indemnity</w:t>
-              <w:tab/>
-              <w:t>21</w:t>
-            </w:r>
-          </w:hyperlink>
-        </w:p>
-        <w:p>
-          <w:pPr>
-            <w:pStyle w:val="TOC2"/>
-            <w:tabs>
-              <w:tab w:val="clear" w:pos="900"/>
-              <w:tab w:val="clear" w:pos="9350"/>
-              <w:tab w:val="right" w:pos="9025" w:leader="dot"/>
-            </w:tabs>
-            <w:rPr/>
-          </w:pPr>
-          <w:hyperlink w:anchor="__RefHeading___Toc1729_460044586">
-            <w:r>
-              <w:rPr>
-                <w:webHidden/>
-                <w:rStyle w:val="IndexLink"/>
-              </w:rPr>
-              <w:t>18.3 Procedure</w:t>
-              <w:tab/>
-              <w:t>21</w:t>
-            </w:r>
-          </w:hyperlink>
-        </w:p>
-        <w:p>
-          <w:pPr>
-            <w:pStyle w:val="TOC1"/>
-            <w:tabs>
-              <w:tab w:val="clear" w:pos="900"/>
-              <w:tab w:val="clear" w:pos="9350"/>
-              <w:tab w:val="right" w:pos="9025" w:leader="dot"/>
-            </w:tabs>
-            <w:rPr/>
-          </w:pPr>
-          <w:hyperlink w:anchor="__RefHeading___Toc1731_460044586">
-            <w:r>
-              <w:rPr>
-                <w:webHidden/>
-                <w:rStyle w:val="IndexLink"/>
-              </w:rPr>
-              <w:t>19. Force majeure</w:t>
-              <w:tab/>
-              <w:t>22</w:t>
-            </w:r>
-          </w:hyperlink>
-        </w:p>
-        <w:p>
-          <w:pPr>
-            <w:pStyle w:val="TOC1"/>
-            <w:tabs>
-              <w:tab w:val="clear" w:pos="900"/>
-              <w:tab w:val="clear" w:pos="9350"/>
-              <w:tab w:val="right" w:pos="9025" w:leader="dot"/>
-            </w:tabs>
-            <w:rPr/>
-          </w:pPr>
-          <w:hyperlink w:anchor="__RefHeading___Toc1733_460044586">
-            <w:r>
-              <w:rPr>
-                <w:webHidden/>
-                <w:rStyle w:val="IndexLink"/>
-              </w:rPr>
-              <w:t>20. Non-solicitation</w:t>
-              <w:tab/>
-              <w:t>23</w:t>
-            </w:r>
-          </w:hyperlink>
-        </w:p>
-        <w:p>
-          <w:pPr>
-            <w:pStyle w:val="TOC1"/>
-            <w:tabs>
-              <w:tab w:val="clear" w:pos="900"/>
-              <w:tab w:val="clear" w:pos="9350"/>
-              <w:tab w:val="right" w:pos="9025" w:leader="dot"/>
-            </w:tabs>
-            <w:rPr/>
-          </w:pPr>
-          <w:hyperlink w:anchor="__RefHeading___Toc1735_460044586">
-            <w:r>
-              <w:rPr>
-                <w:webHidden/>
-                <w:rStyle w:val="IndexLink"/>
-              </w:rPr>
-              <w:t>21. Assignment and subcontracting</w:t>
-              <w:tab/>
-              <w:t>24</w:t>
-            </w:r>
-          </w:hyperlink>
-        </w:p>
-        <w:p>
-          <w:pPr>
-            <w:pStyle w:val="TOC1"/>
-            <w:tabs>
-              <w:tab w:val="clear" w:pos="900"/>
-              <w:tab w:val="clear" w:pos="9350"/>
-              <w:tab w:val="right" w:pos="9025" w:leader="dot"/>
-            </w:tabs>
-            <w:rPr/>
-          </w:pPr>
-          <w:hyperlink w:anchor="__RefHeading___Toc1737_460044586">
-            <w:r>
-              <w:rPr>
-                <w:webHidden/>
-                <w:rStyle w:val="IndexLink"/>
-              </w:rPr>
-              <w:t>22. Dispute resolution</w:t>
-              <w:tab/>
-              <w:t>25</w:t>
-            </w:r>
-          </w:hyperlink>
-        </w:p>
-        <w:p>
-          <w:pPr>
-            <w:pStyle w:val="TOC2"/>
-            <w:tabs>
-              <w:tab w:val="clear" w:pos="900"/>
-              <w:tab w:val="clear" w:pos="9350"/>
-              <w:tab w:val="right" w:pos="9025" w:leader="dot"/>
-            </w:tabs>
-            <w:rPr/>
-          </w:pPr>
-          <w:hyperlink w:anchor="__RefHeading___Toc1739_460044586">
-            <w:r>
-              <w:rPr>
-                <w:webHidden/>
-                <w:rStyle w:val="IndexLink"/>
-              </w:rPr>
-              <w:t>22.1 Negotiation</w:t>
-              <w:tab/>
-              <w:t>25</w:t>
-            </w:r>
-          </w:hyperlink>
-        </w:p>
-        <w:p>
-          <w:pPr>
-            <w:pStyle w:val="TOC2"/>
-            <w:tabs>
-              <w:tab w:val="clear" w:pos="900"/>
-              <w:tab w:val="clear" w:pos="9350"/>
-              <w:tab w:val="right" w:pos="9025" w:leader="dot"/>
-            </w:tabs>
-            <w:rPr/>
-          </w:pPr>
-          <w:hyperlink w:anchor="__RefHeading___Toc1741_460044586">
-            <w:r>
-              <w:rPr>
-                <w:webHidden/>
-                <w:rStyle w:val="IndexLink"/>
-              </w:rPr>
-              <w:t>22.2 Mediation</w:t>
-              <w:tab/>
-              <w:t>25</w:t>
-            </w:r>
-          </w:hyperlink>
-        </w:p>
-        <w:p>
-          <w:pPr>
-            <w:pStyle w:val="TOC2"/>
-            <w:tabs>
-              <w:tab w:val="clear" w:pos="900"/>
-              <w:tab w:val="clear" w:pos="9350"/>
-              <w:tab w:val="right" w:pos="9025" w:leader="dot"/>
-            </w:tabs>
-            <w:rPr/>
-          </w:pPr>
-          <w:hyperlink w:anchor="__RefHeading___Toc1743_460044586">
-            <w:r>
-              <w:rPr>
-                <w:webHidden/>
-                <w:rStyle w:val="IndexLink"/>
-              </w:rPr>
-              <w:t>22.3 Final resolution: choose one option</w:t>
-              <w:tab/>
-              <w:t>25</w:t>
-            </w:r>
-          </w:hyperlink>
-        </w:p>
-        <w:p>
-          <w:pPr>
-            <w:pStyle w:val="TOC2"/>
-            <w:tabs>
-              <w:tab w:val="clear" w:pos="900"/>
-              <w:tab w:val="clear" w:pos="9350"/>
-              <w:tab w:val="right" w:pos="9025" w:leader="dot"/>
-            </w:tabs>
-            <w:rPr/>
-          </w:pPr>
-          <w:hyperlink w:anchor="__RefHeading___Toc1745_460044586">
-            <w:r>
-              <w:rPr>
-                <w:webHidden/>
-                <w:rStyle w:val="IndexLink"/>
-              </w:rPr>
-              <w:t>22.4 Interim relief and continued performance</w:t>
-              <w:tab/>
-              <w:t>25</w:t>
-            </w:r>
-          </w:hyperlink>
-        </w:p>
-        <w:p>
-          <w:pPr>
-            <w:pStyle w:val="TOC1"/>
-            <w:tabs>
-              <w:tab w:val="clear" w:pos="900"/>
-              <w:tab w:val="clear" w:pos="9350"/>
-              <w:tab w:val="right" w:pos="9025" w:leader="dot"/>
-            </w:tabs>
-            <w:rPr/>
-          </w:pPr>
-          <w:hyperlink w:anchor="__RefHeading___Toc1747_460044586">
-            <w:r>
-              <w:rPr>
-                <w:webHidden/>
-                <w:rStyle w:val="IndexLink"/>
-              </w:rPr>
-              <w:t>23. Governing law</w:t>
-              <w:tab/>
-              <w:t>26</w:t>
-            </w:r>
-          </w:hyperlink>
-        </w:p>
-        <w:p>
-          <w:pPr>
-            <w:pStyle w:val="TOC1"/>
-            <w:tabs>
-              <w:tab w:val="clear" w:pos="900"/>
-              <w:tab w:val="clear" w:pos="9350"/>
-              <w:tab w:val="right" w:pos="9025" w:leader="dot"/>
-            </w:tabs>
-            <w:rPr/>
-          </w:pPr>
-          <w:hyperlink w:anchor="__RefHeading___Toc1749_460044586">
-            <w:r>
-              <w:rPr>
-                <w:webHidden/>
-                <w:rStyle w:val="IndexLink"/>
-              </w:rPr>
-              <w:t>24. Notices</w:t>
-              <w:tab/>
-              <w:t>27</w:t>
-            </w:r>
-          </w:hyperlink>
-        </w:p>
-        <w:p>
-          <w:pPr>
-            <w:pStyle w:val="TOC1"/>
-            <w:tabs>
-              <w:tab w:val="clear" w:pos="900"/>
-              <w:tab w:val="clear" w:pos="9350"/>
-              <w:tab w:val="right" w:pos="9025" w:leader="dot"/>
-            </w:tabs>
-            <w:rPr/>
-          </w:pPr>
-          <w:hyperlink w:anchor="__RefHeading___Toc1751_460044586">
-            <w:r>
-              <w:rPr>
-                <w:webHidden/>
-                <w:rStyle w:val="IndexLink"/>
-              </w:rPr>
-              <w:t>25. General</w:t>
-              <w:tab/>
-              <w:t>28</w:t>
-            </w:r>
-          </w:hyperlink>
-        </w:p>
-        <w:p>
-          <w:pPr>
-            <w:pStyle w:val="TOC1"/>
-            <w:tabs>
-              <w:tab w:val="clear" w:pos="900"/>
-              <w:tab w:val="clear" w:pos="9350"/>
-              <w:tab w:val="right" w:pos="9025" w:leader="dot"/>
-            </w:tabs>
-            <w:rPr/>
-          </w:pPr>
-          <w:hyperlink w:anchor="__RefHeading___Toc1753_460044586">
-            <w:r>
-              <w:rPr>
-                <w:webHidden/>
-                <w:rStyle w:val="IndexLink"/>
-              </w:rPr>
-              <w:t>26. Signatures</w:t>
-              <w:tab/>
-              <w:t>29</w:t>
-            </w:r>
-          </w:hyperlink>
-        </w:p>
-        <w:p>
-          <w:pPr>
-            <w:pStyle w:val="TOC1"/>
-            <w:tabs>
-              <w:tab w:val="clear" w:pos="900"/>
-              <w:tab w:val="clear" w:pos="9350"/>
-              <w:tab w:val="right" w:pos="9025" w:leader="dot"/>
-            </w:tabs>
-            <w:rPr/>
-          </w:pPr>
-          <w:hyperlink w:anchor="__RefHeading___Toc1755_460044586">
-            <w:r>
-              <w:rPr>
-                <w:webHidden/>
-                <w:rStyle w:val="IndexLink"/>
-              </w:rPr>
-              <w:t>27. Acknowledgment</w:t>
-              <w:tab/>
-              <w:t>30</w:t>
-            </w:r>
-          </w:hyperlink>
-        </w:p>
-        <w:p>
-          <w:pPr>
-            <w:pStyle w:val="TOC1"/>
-            <w:tabs>
-              <w:tab w:val="clear" w:pos="900"/>
-              <w:tab w:val="clear" w:pos="9350"/>
-              <w:tab w:val="right" w:pos="9025" w:leader="dot"/>
-            </w:tabs>
-            <w:rPr/>
-          </w:pPr>
-          <w:hyperlink w:anchor="__RefHeading___Toc1757_460044586">
-            <w:r>
-              <w:rPr>
-                <w:webHidden/>
-                <w:rStyle w:val="IndexLink"/>
-              </w:rPr>
-              <w:t>28. Annex A: schedules and forms</w:t>
-              <w:tab/>
-              <w:t>31</w:t>
-            </w:r>
-          </w:hyperlink>
-        </w:p>
-        <w:p>
-          <w:pPr>
-            <w:pStyle w:val="TOC1"/>
-            <w:tabs>
-              <w:tab w:val="clear" w:pos="900"/>
-              <w:tab w:val="clear" w:pos="9350"/>
-              <w:tab w:val="right" w:pos="9025" w:leader="dot"/>
-            </w:tabs>
-            <w:rPr/>
-          </w:pPr>
-          <w:hyperlink w:anchor="__RefHeading___Toc1759_460044586">
+          <w:hyperlink w:anchor="__RefHeading___Toc3715_1603226370">
             <w:r>
               <w:rPr>
                 <w:webHidden/>
@@ -2247,14 +1697,14 @@
                 <w:i w:val="false"/>
                 <w:iCs w:val="false"/>
               </w:rPr>
-              <w:t>29. Document Sign-Off</w:t>
+              <w:t>14. Document Sign-Off</w:t>
             </w:r>
             <w:r>
               <w:rPr>
                 <w:rStyle w:val="IndexLink"/>
               </w:rPr>
               <w:tab/>
-              <w:t>32</w:t>
+              <w:t>23</w:t>
             </w:r>
           </w:hyperlink>
           <w:r>
@@ -2287,7 +1737,7 @@
       <w:r>
         <w:br w:type="page"/>
       </w:r>
-      <w:bookmarkStart w:id="0" w:name="__RefHeading___Toc1629_460044586"/>
+      <w:bookmarkStart w:id="0" w:name="__RefHeading___Toc3635_1603226370"/>
       <w:bookmarkStart w:id="1" w:name="_Toc48319687"/>
       <w:bookmarkStart w:id="2" w:name="_Toc11824118"/>
       <w:bookmarkEnd w:id="0"/>
@@ -2932,7 +2382,7 @@
           <w:spacing w:val="0"/>
         </w:rPr>
       </w:pPr>
-      <w:bookmarkStart w:id="4" w:name="__RefHeading___Toc1631_460044586"/>
+      <w:bookmarkStart w:id="4" w:name="__RefHeading___Toc3637_1603226370"/>
       <w:bookmarkStart w:id="5" w:name="_Toc233203388"/>
       <w:bookmarkEnd w:id="4"/>
       <w:r>
@@ -4711,7 +4161,7 @@
         <w:pageBreakBefore w:val="false"/>
         <w:rPr/>
       </w:pPr>
-      <w:bookmarkStart w:id="6" w:name="__RefHeading___Toc1633_460044586"/>
+      <w:bookmarkStart w:id="6" w:name="__RefHeading___Toc3639_1603226370"/>
       <w:bookmarkEnd w:id="6"/>
       <w:r>
         <w:rPr>
@@ -4780,7 +4230,7 @@
         <w:pStyle w:val="Heading1"/>
         <w:rPr/>
       </w:pPr>
-      <w:bookmarkStart w:id="7" w:name="__RefHeading___Toc1635_460044586"/>
+      <w:bookmarkStart w:id="7" w:name="__RefHeading___Toc3641_1603226370"/>
       <w:bookmarkEnd w:id="7"/>
       <w:r>
         <w:rPr>
@@ -5026,7 +4476,7 @@
         <w:pStyle w:val="Heading1"/>
         <w:rPr/>
       </w:pPr>
-      <w:bookmarkStart w:id="8" w:name="__RefHeading___Toc1637_460044586"/>
+      <w:bookmarkStart w:id="8" w:name="__RefHeading___Toc3643_1603226370"/>
       <w:bookmarkEnd w:id="8"/>
       <w:r>
         <w:rPr>
@@ -5043,7 +4493,7 @@
         <w:pStyle w:val="Heading2"/>
         <w:rPr/>
       </w:pPr>
-      <w:bookmarkStart w:id="9" w:name="__RefHeading___Toc1639_460044586"/>
+      <w:bookmarkStart w:id="9" w:name="__RefHeading___Toc3645_1603226370"/>
       <w:bookmarkEnd w:id="9"/>
       <w:r>
         <w:rPr>
@@ -6651,7 +6101,7 @@
         <w:pStyle w:val="Heading2"/>
         <w:rPr/>
       </w:pPr>
-      <w:bookmarkStart w:id="10" w:name="__RefHeading___Toc1641_460044586"/>
+      <w:bookmarkStart w:id="10" w:name="__RefHeading___Toc3647_1603226370"/>
       <w:bookmarkEnd w:id="10"/>
       <w:r>
         <w:rPr>
@@ -6766,7 +6216,7 @@
         <w:pStyle w:val="Heading1"/>
         <w:rPr/>
       </w:pPr>
-      <w:bookmarkStart w:id="11" w:name="__RefHeading___Toc1643_460044586"/>
+      <w:bookmarkStart w:id="11" w:name="__RefHeading___Toc3649_1603226370"/>
       <w:bookmarkEnd w:id="11"/>
       <w:r>
         <w:rPr>
@@ -6775,7 +6225,7 @@
           <w:color w:val="0F4761"/>
           <w:sz w:val="32"/>
         </w:rPr>
-        <w:t>6.  Structure of the agreement</w:t>
+        <w:t>6.  Services and responsibilities</w:t>
       </w:r>
     </w:p>
     <w:p>
@@ -6783,7 +6233,7 @@
         <w:pStyle w:val="Heading2"/>
         <w:rPr/>
       </w:pPr>
-      <w:bookmarkStart w:id="12" w:name="__RefHeading___Toc1645_460044586"/>
+      <w:bookmarkStart w:id="12" w:name="__RefHeading___Toc3651_1603226370"/>
       <w:bookmarkEnd w:id="12"/>
       <w:r>
         <w:rPr>
@@ -6792,7 +6242,22 @@
           <w:color w:val="0F4761"/>
           <w:sz w:val="26"/>
         </w:rPr>
-        <w:t>6.1  Order Forms</w:t>
+        <w:t>6.1  Structure of the agreement</w:t>
+      </w:r>
+    </w:p>
+    <w:p>
+      <w:pPr>
+        <w:pStyle w:val="Heading3"/>
+        <w:rPr/>
+      </w:pPr>
+      <w:r>
+        <w:rPr>
+          <w:rFonts w:eastAsia="Segoe UI" w:cs="Segoe UI"/>
+          <w:b/>
+          <w:color w:val="0F4761"/>
+          <w:sz w:val="23"/>
+        </w:rPr>
+        <w:t>6.1.1  Order Forms</w:t>
       </w:r>
     </w:p>
     <w:p>
@@ -6854,10 +6319,70 @@
     </w:p>
     <w:p>
       <w:pPr>
+        <w:pStyle w:val="Heading3"/>
+        <w:rPr/>
+      </w:pPr>
+      <w:r>
+        <w:rPr>
+          <w:rFonts w:eastAsia="Segoe UI" w:cs="Segoe UI"/>
+          <w:b/>
+          <w:color w:val="0F4761"/>
+          <w:sz w:val="23"/>
+        </w:rPr>
+        <w:t>6.1.2  Order of precedence</w:t>
+      </w:r>
+    </w:p>
+    <w:p>
+      <w:pPr>
+        <w:pStyle w:val="Normal"/>
+        <w:spacing w:lineRule="auto" w:line="276" w:before="0" w:after="120"/>
+        <w:rPr/>
+      </w:pPr>
+      <w:r>
+        <w:rPr>
+          <w:rFonts w:eastAsia="Segoe UI" w:cs="Segoe UI" w:ascii="Segoe UI" w:hAnsi="Segoe UI"/>
+          <w:color w:val="101820"/>
+          <w:sz w:val="21"/>
+        </w:rPr>
+        <w:t>If documents conflict, the following order applies, the first prevailing: (a) the Data Processing Agreement on matters of Personal Data; (b) the Order Form, but only for the specific purchase and only where it expressly states that it overrides this Agreement; (c) this Agreement; (d) the schedules named in the Order Form; (e) the SOW; (f) the Documentation.</w:t>
+      </w:r>
+    </w:p>
+    <w:p>
+      <w:pPr>
+        <w:pStyle w:val="Heading3"/>
+        <w:rPr/>
+      </w:pPr>
+      <w:r>
+        <w:rPr>
+          <w:rFonts w:eastAsia="Segoe UI" w:cs="Segoe UI"/>
+          <w:b/>
+          <w:color w:val="0F4761"/>
+          <w:sz w:val="23"/>
+        </w:rPr>
+        <w:t>6.1.3  Affiliates</w:t>
+      </w:r>
+    </w:p>
+    <w:p>
+      <w:pPr>
+        <w:pStyle w:val="Normal"/>
+        <w:spacing w:lineRule="auto" w:line="276" w:before="0" w:after="120"/>
+        <w:rPr/>
+      </w:pPr>
+      <w:r>
+        <w:rPr>
+          <w:rFonts w:eastAsia="Segoe UI" w:cs="Segoe UI" w:ascii="Segoe UI" w:hAnsi="Segoe UI"/>
+          <w:color w:val="101820"/>
+          <w:sz w:val="21"/>
+        </w:rPr>
+        <w:t>An Affiliate of the Client may sign an Order Form under this Agreement with the written consent of iorta TechNXT. The Affiliate is then the Client for that Order Form.</w:t>
+      </w:r>
+    </w:p>
+    <w:p>
+      <w:pPr>
         <w:pStyle w:val="Heading2"/>
         <w:rPr/>
       </w:pPr>
-      <w:bookmarkStart w:id="13" w:name="__RefHeading___Toc1647_460044586"/>
+      <w:bookmarkStart w:id="13" w:name="__RefHeading___Toc3653_1603226370"/>
       <w:bookmarkEnd w:id="13"/>
       <w:r>
         <w:rPr>
@@ -6866,91 +6391,22 @@
           <w:color w:val="0F4761"/>
           <w:sz w:val="26"/>
         </w:rPr>
-        <w:t>6.2  Order of precedence</w:t>
-      </w:r>
-    </w:p>
-    <w:p>
-      <w:pPr>
-        <w:pStyle w:val="Normal"/>
-        <w:spacing w:lineRule="auto" w:line="276" w:before="0" w:after="120"/>
-        <w:rPr/>
-      </w:pPr>
-      <w:r>
-        <w:rPr>
-          <w:rFonts w:eastAsia="Segoe UI" w:cs="Segoe UI" w:ascii="Segoe UI" w:hAnsi="Segoe UI"/>
-          <w:color w:val="101820"/>
-          <w:sz w:val="21"/>
-        </w:rPr>
-        <w:t>If documents conflict, the following order applies, the first prevailing: (a) the Data Processing Agreement on matters of Personal Data; (b) the Order Form, but only for the specific purchase and only where it expressly states that it overrides this Agreement; (c) this Agreement; (d) the schedules named in the Order Form; (e) the SOW; (f) the Documentation.</w:t>
-      </w:r>
-    </w:p>
-    <w:p>
-      <w:pPr>
-        <w:pStyle w:val="Heading2"/>
-        <w:rPr/>
-      </w:pPr>
-      <w:bookmarkStart w:id="14" w:name="__RefHeading___Toc1649_460044586"/>
-      <w:bookmarkEnd w:id="14"/>
+        <w:t>6.2  Scope of services</w:t>
+      </w:r>
+    </w:p>
+    <w:p>
+      <w:pPr>
+        <w:pStyle w:val="Heading3"/>
+        <w:rPr/>
+      </w:pPr>
       <w:r>
         <w:rPr>
           <w:rFonts w:eastAsia="Segoe UI" w:cs="Segoe UI"/>
           <w:b/>
           <w:color w:val="0F4761"/>
-          <w:sz w:val="26"/>
-        </w:rPr>
-        <w:t>6.3  Affiliates</w:t>
-      </w:r>
-    </w:p>
-    <w:p>
-      <w:pPr>
-        <w:pStyle w:val="Normal"/>
-        <w:spacing w:lineRule="auto" w:line="276" w:before="0" w:after="120"/>
-        <w:rPr/>
-      </w:pPr>
-      <w:r>
-        <w:rPr>
-          <w:rFonts w:eastAsia="Segoe UI" w:cs="Segoe UI" w:ascii="Segoe UI" w:hAnsi="Segoe UI"/>
-          <w:color w:val="101820"/>
-          <w:sz w:val="21"/>
-        </w:rPr>
-        <w:t>An Affiliate of the Client may sign an Order Form under this Agreement with the written consent of iorta TechNXT. The Affiliate is then the Client for that Order Form.</w:t>
-      </w:r>
-      <w:r>
-        <w:br w:type="page"/>
-      </w:r>
-    </w:p>
-    <w:p>
-      <w:pPr>
-        <w:pStyle w:val="Heading1"/>
-        <w:rPr/>
-      </w:pPr>
-      <w:bookmarkStart w:id="15" w:name="__RefHeading___Toc1651_460044586"/>
-      <w:bookmarkEnd w:id="15"/>
-      <w:r>
-        <w:rPr>
-          <w:rFonts w:eastAsia="Segoe UI" w:cs="Segoe UI" w:ascii="Segoe UI" w:hAnsi="Segoe UI"/>
-          <w:b/>
-          <w:color w:val="0F4761"/>
-          <w:sz w:val="32"/>
-        </w:rPr>
-        <w:t>7.  Services</w:t>
-      </w:r>
-    </w:p>
-    <w:p>
-      <w:pPr>
-        <w:pStyle w:val="Heading2"/>
-        <w:rPr/>
-      </w:pPr>
-      <w:bookmarkStart w:id="16" w:name="__RefHeading___Toc1653_460044586"/>
-      <w:bookmarkEnd w:id="16"/>
-      <w:r>
-        <w:rPr>
-          <w:rFonts w:eastAsia="Segoe UI" w:cs="Segoe UI"/>
-          <w:b/>
-          <w:color w:val="0F4761"/>
-          <w:sz w:val="26"/>
-        </w:rPr>
-        <w:t>7.1  Scope</w:t>
+          <w:sz w:val="23"/>
+        </w:rPr>
+        <w:t>6.2.1  Scope</w:t>
       </w:r>
     </w:p>
     <w:p>
@@ -7012,19 +6468,17 @@
     </w:p>
     <w:p>
       <w:pPr>
-        <w:pStyle w:val="Heading2"/>
-        <w:rPr/>
-      </w:pPr>
-      <w:bookmarkStart w:id="17" w:name="__RefHeading___Toc1655_460044586"/>
-      <w:bookmarkEnd w:id="17"/>
+        <w:pStyle w:val="Heading3"/>
+        <w:rPr/>
+      </w:pPr>
       <w:r>
         <w:rPr>
           <w:rFonts w:eastAsia="Segoe UI" w:cs="Segoe UI"/>
           <w:b/>
           <w:color w:val="0F4761"/>
-          <w:sz w:val="26"/>
-        </w:rPr>
-        <w:t>7.2  Personnel</w:t>
+          <w:sz w:val="23"/>
+        </w:rPr>
+        <w:t>6.2.2  Personnel</w:t>
       </w:r>
     </w:p>
     <w:p>
@@ -7086,11 +6540,71 @@
     </w:p>
     <w:p>
       <w:pPr>
+        <w:pStyle w:val="Heading3"/>
+        <w:rPr/>
+      </w:pPr>
+      <w:r>
+        <w:rPr>
+          <w:rFonts w:eastAsia="Segoe UI" w:cs="Segoe UI"/>
+          <w:b/>
+          <w:color w:val="0F4761"/>
+          <w:sz w:val="23"/>
+        </w:rPr>
+        <w:t>6.2.3  Subcontractors</w:t>
+      </w:r>
+    </w:p>
+    <w:p>
+      <w:pPr>
+        <w:pStyle w:val="Normal"/>
+        <w:spacing w:lineRule="auto" w:line="276" w:before="0" w:after="120"/>
+        <w:rPr/>
+      </w:pPr>
+      <w:r>
+        <w:rPr>
+          <w:rFonts w:eastAsia="Segoe UI" w:cs="Segoe UI" w:ascii="Segoe UI" w:hAnsi="Segoe UI"/>
+          <w:color w:val="101820"/>
+          <w:sz w:val="21"/>
+        </w:rPr>
+        <w:t>iorta TechNXT may use subcontractors, including cloud and hosting providers, to perform the Services. iorta TechNXT remains responsible for its subcontractors. Sub-processors of Personal Data are governed by the Data Processing Agreement.</w:t>
+      </w:r>
+    </w:p>
+    <w:p>
+      <w:pPr>
+        <w:pStyle w:val="Heading3"/>
+        <w:rPr/>
+      </w:pPr>
+      <w:r>
+        <w:rPr>
+          <w:rFonts w:eastAsia="Segoe UI" w:cs="Segoe UI"/>
+          <w:b/>
+          <w:color w:val="0F4761"/>
+          <w:sz w:val="23"/>
+        </w:rPr>
+        <w:t>6.2.4  Change control</w:t>
+      </w:r>
+    </w:p>
+    <w:p>
+      <w:pPr>
+        <w:pStyle w:val="Normal"/>
+        <w:spacing w:lineRule="auto" w:line="276" w:before="0" w:after="120"/>
+        <w:rPr/>
+      </w:pPr>
+      <w:r>
+        <w:rPr>
+          <w:rFonts w:eastAsia="Segoe UI" w:cs="Segoe UI" w:ascii="Segoe UI" w:hAnsi="Segoe UI"/>
+          <w:color w:val="101820"/>
+          <w:sz w:val="21"/>
+        </w:rPr>
+        <w:t>Any change to the scope, plan, Deliverables or Fees of an Order Form is made through the Change Request Procedure. No change binds a Party until a Change Request or an amendment is signed by both Parties.</w:t>
+      </w:r>
+    </w:p>
+    <w:p>
+      <w:pPr>
         <w:pStyle w:val="Heading2"/>
         <w:rPr/>
       </w:pPr>
-      <w:bookmarkStart w:id="18" w:name="__RefHeading___Toc1657_460044586"/>
-      <w:bookmarkEnd w:id="18"/>
+      <w:bookmarkStart w:id="14" w:name="__RefHeading___Toc3655_1603226370"/>
+      <w:bookmarkEnd w:id="14"/>
       <w:r>
         <w:rPr>
           <w:rFonts w:eastAsia="Segoe UI" w:cs="Segoe UI"/>
@@ -7098,74 +6612,7 @@
           <w:color w:val="0F4761"/>
           <w:sz w:val="26"/>
         </w:rPr>
-        <w:t>7.3  Subcontractors</w:t>
-      </w:r>
-    </w:p>
-    <w:p>
-      <w:pPr>
-        <w:pStyle w:val="Normal"/>
-        <w:spacing w:lineRule="auto" w:line="276" w:before="0" w:after="120"/>
-        <w:rPr/>
-      </w:pPr>
-      <w:r>
-        <w:rPr>
-          <w:rFonts w:eastAsia="Segoe UI" w:cs="Segoe UI" w:ascii="Segoe UI" w:hAnsi="Segoe UI"/>
-          <w:color w:val="101820"/>
-          <w:sz w:val="21"/>
-        </w:rPr>
-        <w:t>iorta TechNXT may use subcontractors, including cloud and hosting providers, to perform the Services. iorta TechNXT remains responsible for its subcontractors. Sub-processors of Personal Data are governed by the Data Processing Agreement.</w:t>
-      </w:r>
-    </w:p>
-    <w:p>
-      <w:pPr>
-        <w:pStyle w:val="Heading2"/>
-        <w:rPr/>
-      </w:pPr>
-      <w:bookmarkStart w:id="19" w:name="__RefHeading___Toc1659_460044586"/>
-      <w:bookmarkEnd w:id="19"/>
-      <w:r>
-        <w:rPr>
-          <w:rFonts w:eastAsia="Segoe UI" w:cs="Segoe UI"/>
-          <w:b/>
-          <w:color w:val="0F4761"/>
-          <w:sz w:val="26"/>
-        </w:rPr>
-        <w:t>7.4  Change control</w:t>
-      </w:r>
-    </w:p>
-    <w:p>
-      <w:pPr>
-        <w:pStyle w:val="Normal"/>
-        <w:spacing w:lineRule="auto" w:line="276" w:before="0" w:after="120"/>
-        <w:rPr/>
-      </w:pPr>
-      <w:r>
-        <w:rPr>
-          <w:rFonts w:eastAsia="Segoe UI" w:cs="Segoe UI" w:ascii="Segoe UI" w:hAnsi="Segoe UI"/>
-          <w:color w:val="101820"/>
-          <w:sz w:val="21"/>
-        </w:rPr>
-        <w:t>Any change to the scope, plan, Deliverables or Fees of an Order Form is made through the Change Request Procedure. No change binds a Party until a Change Request or an amendment is signed by both Parties.</w:t>
-      </w:r>
-      <w:r>
-        <w:br w:type="page"/>
-      </w:r>
-    </w:p>
-    <w:p>
-      <w:pPr>
-        <w:pStyle w:val="Heading1"/>
-        <w:rPr/>
-      </w:pPr>
-      <w:bookmarkStart w:id="20" w:name="__RefHeading___Toc1661_460044586"/>
-      <w:bookmarkEnd w:id="20"/>
-      <w:r>
-        <w:rPr>
-          <w:rFonts w:eastAsia="Segoe UI" w:cs="Segoe UI" w:ascii="Segoe UI" w:hAnsi="Segoe UI"/>
-          <w:b/>
-          <w:color w:val="0F4761"/>
-          <w:sz w:val="32"/>
-        </w:rPr>
-        <w:t>8.  Client responsibilities</w:t>
+        <w:t>6.3  Client responsibilities</w:t>
       </w:r>
     </w:p>
     <w:p>
@@ -7358,8 +6805,8 @@
         <w:pStyle w:val="Heading1"/>
         <w:rPr/>
       </w:pPr>
-      <w:bookmarkStart w:id="21" w:name="__RefHeading___Toc1663_460044586"/>
-      <w:bookmarkEnd w:id="21"/>
+      <w:bookmarkStart w:id="15" w:name="__RefHeading___Toc3657_1603226370"/>
+      <w:bookmarkEnd w:id="15"/>
       <w:r>
         <w:rPr>
           <w:rFonts w:eastAsia="Segoe UI" w:cs="Segoe UI" w:ascii="Segoe UI" w:hAnsi="Segoe UI"/>
@@ -7367,7 +6814,7 @@
           <w:color w:val="0F4761"/>
           <w:sz w:val="32"/>
         </w:rPr>
-        <w:t>9.  Fees and payment</w:t>
+        <w:t>7.  Fees and taxes</w:t>
       </w:r>
     </w:p>
     <w:p>
@@ -7375,8 +6822,8 @@
         <w:pStyle w:val="Heading2"/>
         <w:rPr/>
       </w:pPr>
-      <w:bookmarkStart w:id="22" w:name="__RefHeading___Toc1665_460044586"/>
-      <w:bookmarkEnd w:id="22"/>
+      <w:bookmarkStart w:id="16" w:name="__RefHeading___Toc3659_1603226370"/>
+      <w:bookmarkEnd w:id="16"/>
       <w:r>
         <w:rPr>
           <w:rFonts w:eastAsia="Segoe UI" w:cs="Segoe UI"/>
@@ -7384,7 +6831,22 @@
           <w:color w:val="0F4761"/>
           <w:sz w:val="26"/>
         </w:rPr>
-        <w:t>9.1  Fees</w:t>
+        <w:t>7.1  Fees and payment</w:t>
+      </w:r>
+    </w:p>
+    <w:p>
+      <w:pPr>
+        <w:pStyle w:val="Heading3"/>
+        <w:rPr/>
+      </w:pPr>
+      <w:r>
+        <w:rPr>
+          <w:rFonts w:eastAsia="Segoe UI" w:cs="Segoe UI"/>
+          <w:b/>
+          <w:color w:val="0F4761"/>
+          <w:sz w:val="23"/>
+        </w:rPr>
+        <w:t>7.1.1  Fees</w:t>
       </w:r>
     </w:p>
     <w:p>
@@ -7446,19 +6908,17 @@
     </w:p>
     <w:p>
       <w:pPr>
-        <w:pStyle w:val="Heading2"/>
-        <w:rPr/>
-      </w:pPr>
-      <w:bookmarkStart w:id="23" w:name="__RefHeading___Toc1667_460044586"/>
-      <w:bookmarkEnd w:id="23"/>
+        <w:pStyle w:val="Heading3"/>
+        <w:rPr/>
+      </w:pPr>
       <w:r>
         <w:rPr>
           <w:rFonts w:eastAsia="Segoe UI" w:cs="Segoe UI"/>
           <w:b/>
           <w:color w:val="0F4761"/>
-          <w:sz w:val="26"/>
-        </w:rPr>
-        <w:t>9.2  Invoicing and payment</w:t>
+          <w:sz w:val="23"/>
+        </w:rPr>
+        <w:t>7.1.2  Invoicing and payment</w:t>
       </w:r>
     </w:p>
     <w:p>
@@ -7574,34 +7034,14 @@
         </w:rPr>
         <w:t>Bank charges of the Client's bank are for the Client's account.</w:t>
       </w:r>
-      <w:r>
-        <w:br w:type="page"/>
-      </w:r>
-    </w:p>
-    <w:p>
-      <w:pPr>
-        <w:pStyle w:val="Heading1"/>
-        <w:rPr/>
-      </w:pPr>
-      <w:bookmarkStart w:id="24" w:name="__RefHeading___Toc1669_460044586"/>
-      <w:bookmarkEnd w:id="24"/>
-      <w:r>
-        <w:rPr>
-          <w:rFonts w:eastAsia="Segoe UI" w:cs="Segoe UI" w:ascii="Segoe UI" w:hAnsi="Segoe UI"/>
-          <w:b/>
-          <w:color w:val="0F4761"/>
-          <w:sz w:val="32"/>
-        </w:rPr>
-        <w:t>10.  Taxes</w:t>
-      </w:r>
     </w:p>
     <w:p>
       <w:pPr>
         <w:pStyle w:val="Heading2"/>
         <w:rPr/>
       </w:pPr>
-      <w:bookmarkStart w:id="25" w:name="__RefHeading___Toc1671_460044586"/>
-      <w:bookmarkEnd w:id="25"/>
+      <w:bookmarkStart w:id="17" w:name="__RefHeading___Toc3661_1603226370"/>
+      <w:bookmarkEnd w:id="17"/>
       <w:r>
         <w:rPr>
           <w:rFonts w:eastAsia="Segoe UI" w:cs="Segoe UI"/>
@@ -7609,7 +7049,22 @@
           <w:color w:val="0F4761"/>
           <w:sz w:val="26"/>
         </w:rPr>
-        <w:t>10.1  VAT</w:t>
+        <w:t>7.2  Taxes</w:t>
+      </w:r>
+    </w:p>
+    <w:p>
+      <w:pPr>
+        <w:pStyle w:val="Heading3"/>
+        <w:rPr/>
+      </w:pPr>
+      <w:r>
+        <w:rPr>
+          <w:rFonts w:eastAsia="Segoe UI" w:cs="Segoe UI"/>
+          <w:b/>
+          <w:color w:val="0F4761"/>
+          <w:sz w:val="23"/>
+        </w:rPr>
+        <w:t>7.2.1  VAT</w:t>
       </w:r>
     </w:p>
     <w:p>
@@ -7629,19 +7084,17 @@
     </w:p>
     <w:p>
       <w:pPr>
-        <w:pStyle w:val="Heading2"/>
-        <w:rPr/>
-      </w:pPr>
-      <w:bookmarkStart w:id="26" w:name="__RefHeading___Toc1673_460044586"/>
-      <w:bookmarkEnd w:id="26"/>
+        <w:pStyle w:val="Heading3"/>
+        <w:rPr/>
+      </w:pPr>
       <w:r>
         <w:rPr>
           <w:rFonts w:eastAsia="Segoe UI" w:cs="Segoe UI"/>
           <w:b/>
           <w:color w:val="0F4761"/>
-          <w:sz w:val="26"/>
-        </w:rPr>
-        <w:t>10.2  Withholding taxes</w:t>
+          <w:sz w:val="23"/>
+        </w:rPr>
+        <w:t>7.2.2  Withholding taxes</w:t>
       </w:r>
     </w:p>
     <w:p>
@@ -7703,11 +7156,61 @@
     </w:p>
     <w:p>
       <w:pPr>
+        <w:pStyle w:val="Heading3"/>
+        <w:rPr/>
+      </w:pPr>
+      <w:r>
+        <w:rPr>
+          <w:rFonts w:eastAsia="Segoe UI" w:cs="Segoe UI"/>
+          <w:b/>
+          <w:color w:val="0F4761"/>
+          <w:sz w:val="23"/>
+        </w:rPr>
+        <w:t>7.2.3  Other taxes</w:t>
+      </w:r>
+    </w:p>
+    <w:p>
+      <w:pPr>
+        <w:pStyle w:val="Normal"/>
+        <w:spacing w:lineRule="auto" w:line="276" w:before="0" w:after="120"/>
+        <w:rPr/>
+      </w:pPr>
+      <w:r>
+        <w:rPr>
+          <w:rFonts w:eastAsia="Segoe UI" w:cs="Segoe UI" w:ascii="Segoe UI" w:hAnsi="Segoe UI"/>
+          <w:color w:val="101820"/>
+          <w:sz w:val="21"/>
+        </w:rPr>
+        <w:t>Each Party bears its own income tax. Documentary stamp tax on this Agreement, if any, is for the account of [the Client / both Parties in equal shares]. Taxes that a new law imposes on the Services after the Effective Date are added to the Fees.</w:t>
+      </w:r>
+      <w:r>
+        <w:br w:type="page"/>
+      </w:r>
+    </w:p>
+    <w:p>
+      <w:pPr>
+        <w:pStyle w:val="Heading1"/>
+        <w:rPr/>
+      </w:pPr>
+      <w:bookmarkStart w:id="18" w:name="__RefHeading___Toc3663_1603226370"/>
+      <w:bookmarkEnd w:id="18"/>
+      <w:r>
+        <w:rPr>
+          <w:rFonts w:eastAsia="Segoe UI" w:cs="Segoe UI" w:ascii="Segoe UI" w:hAnsi="Segoe UI"/>
+          <w:b/>
+          <w:color w:val="0F4761"/>
+          <w:sz w:val="32"/>
+        </w:rPr>
+        <w:t>8.  Term and termination</w:t>
+      </w:r>
+    </w:p>
+    <w:p>
+      <w:pPr>
         <w:pStyle w:val="Heading2"/>
         <w:rPr/>
       </w:pPr>
-      <w:bookmarkStart w:id="27" w:name="__RefHeading___Toc1675_460044586"/>
-      <w:bookmarkEnd w:id="27"/>
+      <w:bookmarkStart w:id="19" w:name="__RefHeading___Toc3665_1603226370"/>
+      <w:bookmarkEnd w:id="19"/>
       <w:r>
         <w:rPr>
           <w:rFonts w:eastAsia="Segoe UI" w:cs="Segoe UI"/>
@@ -7715,7 +7218,7 @@
           <w:color w:val="0F4761"/>
           <w:sz w:val="26"/>
         </w:rPr>
-        <w:t>10.3  Other taxes</w:t>
+        <w:t>8.1  Term</w:t>
       </w:r>
     </w:p>
     <w:p>
@@ -7730,27 +7233,7 @@
           <w:color w:val="101820"/>
           <w:sz w:val="21"/>
         </w:rPr>
-        <w:t>Each Party bears its own income tax. Documentary stamp tax on this Agreement, if any, is for the account of [the Client / both Parties in equal shares]. Taxes that a new law imposes on the Services after the Effective Date are added to the Fees.</w:t>
-      </w:r>
-      <w:r>
-        <w:br w:type="page"/>
-      </w:r>
-    </w:p>
-    <w:p>
-      <w:pPr>
-        <w:pStyle w:val="Heading1"/>
-        <w:rPr/>
-      </w:pPr>
-      <w:bookmarkStart w:id="28" w:name="__RefHeading___Toc1677_460044586"/>
-      <w:bookmarkEnd w:id="28"/>
-      <w:r>
-        <w:rPr>
-          <w:rFonts w:eastAsia="Segoe UI" w:cs="Segoe UI" w:ascii="Segoe UI" w:hAnsi="Segoe UI"/>
-          <w:b/>
-          <w:color w:val="0F4761"/>
-          <w:sz w:val="32"/>
-        </w:rPr>
-        <w:t>11.  Term and termination</w:t>
+        <w:t>This Agreement starts on the Effective Date and continues until terminated under this clause. Each Order Form has the term stated in it. Termination of this Agreement does not end an Order Form then in force, which continues to be governed by this Agreement until it ends.</w:t>
       </w:r>
     </w:p>
     <w:p>
@@ -7758,8 +7241,8 @@
         <w:pStyle w:val="Heading2"/>
         <w:rPr/>
       </w:pPr>
-      <w:bookmarkStart w:id="29" w:name="__RefHeading___Toc1679_460044586"/>
-      <w:bookmarkEnd w:id="29"/>
+      <w:bookmarkStart w:id="20" w:name="__RefHeading___Toc3667_1603226370"/>
+      <w:bookmarkEnd w:id="20"/>
       <w:r>
         <w:rPr>
           <w:rFonts w:eastAsia="Segoe UI" w:cs="Segoe UI"/>
@@ -7767,39 +7250,7 @@
           <w:color w:val="0F4761"/>
           <w:sz w:val="26"/>
         </w:rPr>
-        <w:t>11.1  Term</w:t>
-      </w:r>
-    </w:p>
-    <w:p>
-      <w:pPr>
-        <w:pStyle w:val="Normal"/>
-        <w:spacing w:lineRule="auto" w:line="276" w:before="0" w:after="120"/>
-        <w:rPr/>
-      </w:pPr>
-      <w:r>
-        <w:rPr>
-          <w:rFonts w:eastAsia="Segoe UI" w:cs="Segoe UI" w:ascii="Segoe UI" w:hAnsi="Segoe UI"/>
-          <w:color w:val="101820"/>
-          <w:sz w:val="21"/>
-        </w:rPr>
-        <w:t>This Agreement starts on the Effective Date and continues until terminated under this clause. Each Order Form has the term stated in it. Termination of this Agreement does not end an Order Form then in force, which continues to be governed by this Agreement until it ends.</w:t>
-      </w:r>
-    </w:p>
-    <w:p>
-      <w:pPr>
-        <w:pStyle w:val="Heading2"/>
-        <w:rPr/>
-      </w:pPr>
-      <w:bookmarkStart w:id="30" w:name="__RefHeading___Toc1681_460044586"/>
-      <w:bookmarkEnd w:id="30"/>
-      <w:r>
-        <w:rPr>
-          <w:rFonts w:eastAsia="Segoe UI" w:cs="Segoe UI"/>
-          <w:b/>
-          <w:color w:val="0F4761"/>
-          <w:sz w:val="26"/>
-        </w:rPr>
-        <w:t>11.2  Termination for cause</w:t>
+        <w:t>8.2  Termination for cause</w:t>
       </w:r>
     </w:p>
     <w:p>
@@ -7879,8 +7330,8 @@
         <w:pStyle w:val="Heading2"/>
         <w:rPr/>
       </w:pPr>
-      <w:bookmarkStart w:id="31" w:name="__RefHeading___Toc1683_460044586"/>
-      <w:bookmarkEnd w:id="31"/>
+      <w:bookmarkStart w:id="21" w:name="__RefHeading___Toc3669_1603226370"/>
+      <w:bookmarkEnd w:id="21"/>
       <w:r>
         <w:rPr>
           <w:rFonts w:eastAsia="Segoe UI" w:cs="Segoe UI"/>
@@ -7888,7 +7339,7 @@
           <w:color w:val="0F4761"/>
           <w:sz w:val="26"/>
         </w:rPr>
-        <w:t>11.3  Termination for convenience</w:t>
+        <w:t>8.3  Termination for convenience</w:t>
       </w:r>
     </w:p>
     <w:p>
@@ -7911,8 +7362,8 @@
         <w:pStyle w:val="Heading2"/>
         <w:rPr/>
       </w:pPr>
-      <w:bookmarkStart w:id="32" w:name="__RefHeading___Toc1685_460044586"/>
-      <w:bookmarkEnd w:id="32"/>
+      <w:bookmarkStart w:id="22" w:name="__RefHeading___Toc3671_1603226370"/>
+      <w:bookmarkEnd w:id="22"/>
       <w:r>
         <w:rPr>
           <w:rFonts w:eastAsia="Segoe UI" w:cs="Segoe UI"/>
@@ -7920,7 +7371,7 @@
           <w:color w:val="0F4761"/>
           <w:sz w:val="26"/>
         </w:rPr>
-        <w:t>11.4  Effect of termination</w:t>
+        <w:t>8.4  Effect of termination</w:t>
       </w:r>
     </w:p>
     <w:p>
@@ -8026,8 +7477,8 @@
         <w:pStyle w:val="Heading1"/>
         <w:rPr/>
       </w:pPr>
-      <w:bookmarkStart w:id="33" w:name="__RefHeading___Toc1687_460044586"/>
-      <w:bookmarkEnd w:id="33"/>
+      <w:bookmarkStart w:id="23" w:name="__RefHeading___Toc3673_1603226370"/>
+      <w:bookmarkEnd w:id="23"/>
       <w:r>
         <w:rPr>
           <w:rFonts w:eastAsia="Segoe UI" w:cs="Segoe UI" w:ascii="Segoe UI" w:hAnsi="Segoe UI"/>
@@ -8035,7 +7486,7 @@
           <w:color w:val="0F4761"/>
           <w:sz w:val="32"/>
         </w:rPr>
-        <w:t>12.  Intellectual property</w:t>
+        <w:t>9.  Rights in the platform and in data</w:t>
       </w:r>
     </w:p>
     <w:p>
@@ -8043,8 +7494,8 @@
         <w:pStyle w:val="Heading2"/>
         <w:rPr/>
       </w:pPr>
-      <w:bookmarkStart w:id="34" w:name="__RefHeading___Toc1689_460044586"/>
-      <w:bookmarkEnd w:id="34"/>
+      <w:bookmarkStart w:id="24" w:name="__RefHeading___Toc3675_1603226370"/>
+      <w:bookmarkEnd w:id="24"/>
       <w:r>
         <w:rPr>
           <w:rFonts w:eastAsia="Segoe UI" w:cs="Segoe UI"/>
@@ -8052,7 +7503,22 @@
           <w:color w:val="0F4761"/>
           <w:sz w:val="26"/>
         </w:rPr>
-        <w:t>12.1  Platform</w:t>
+        <w:t>9.1  Intellectual property</w:t>
+      </w:r>
+    </w:p>
+    <w:p>
+      <w:pPr>
+        <w:pStyle w:val="Heading3"/>
+        <w:rPr/>
+      </w:pPr>
+      <w:r>
+        <w:rPr>
+          <w:rFonts w:eastAsia="Segoe UI" w:cs="Segoe UI"/>
+          <w:b/>
+          <w:color w:val="0F4761"/>
+          <w:sz w:val="23"/>
+        </w:rPr>
+        <w:t>9.1.1  Platform</w:t>
       </w:r>
     </w:p>
     <w:p>
@@ -8114,19 +7580,17 @@
     </w:p>
     <w:p>
       <w:pPr>
-        <w:pStyle w:val="Heading2"/>
-        <w:rPr/>
-      </w:pPr>
-      <w:bookmarkStart w:id="35" w:name="__RefHeading___Toc1691_460044586"/>
-      <w:bookmarkEnd w:id="35"/>
+        <w:pStyle w:val="Heading3"/>
+        <w:rPr/>
+      </w:pPr>
       <w:r>
         <w:rPr>
           <w:rFonts w:eastAsia="Segoe UI" w:cs="Segoe UI"/>
           <w:b/>
           <w:color w:val="0F4761"/>
-          <w:sz w:val="26"/>
-        </w:rPr>
-        <w:t>12.2  Client Data</w:t>
+          <w:sz w:val="23"/>
+        </w:rPr>
+        <w:t>9.1.2  Client Data</w:t>
       </w:r>
     </w:p>
     <w:p>
@@ -8169,11 +7633,41 @@
     </w:p>
     <w:p>
       <w:pPr>
+        <w:pStyle w:val="Heading3"/>
+        <w:rPr/>
+      </w:pPr>
+      <w:r>
+        <w:rPr>
+          <w:rFonts w:eastAsia="Segoe UI" w:cs="Segoe UI"/>
+          <w:b/>
+          <w:color w:val="0F4761"/>
+          <w:sz w:val="23"/>
+        </w:rPr>
+        <w:t>9.1.3  Feedback and statistics</w:t>
+      </w:r>
+    </w:p>
+    <w:p>
+      <w:pPr>
+        <w:pStyle w:val="Normal"/>
+        <w:spacing w:lineRule="auto" w:line="276" w:before="0" w:after="120"/>
+        <w:rPr/>
+      </w:pPr>
+      <w:r>
+        <w:rPr>
+          <w:rFonts w:eastAsia="Segoe UI" w:cs="Segoe UI" w:ascii="Segoe UI" w:hAnsi="Segoe UI"/>
+          <w:color w:val="101820"/>
+          <w:sz w:val="21"/>
+        </w:rPr>
+        <w:t>iorta TechNXT may use suggestions from the Client to improve the Platform without obligation. iorta TechNXT may use technical and usage statistics that do not identify the Client, its clients or any individual, to operate and improve the Platform.</w:t>
+      </w:r>
+    </w:p>
+    <w:p>
+      <w:pPr>
         <w:pStyle w:val="Heading2"/>
         <w:rPr/>
       </w:pPr>
-      <w:bookmarkStart w:id="36" w:name="__RefHeading___Toc1693_460044586"/>
-      <w:bookmarkEnd w:id="36"/>
+      <w:bookmarkStart w:id="25" w:name="__RefHeading___Toc3677_1603226370"/>
+      <w:bookmarkEnd w:id="25"/>
       <w:r>
         <w:rPr>
           <w:rFonts w:eastAsia="Segoe UI" w:cs="Segoe UI"/>
@@ -8181,7 +7675,7 @@
           <w:color w:val="0F4761"/>
           <w:sz w:val="26"/>
         </w:rPr>
-        <w:t>12.3  Feedback and statistics</w:t>
+        <w:t>9.2  Licence grant</w:t>
       </w:r>
     </w:p>
     <w:p>
@@ -8196,71 +7690,16 @@
           <w:color w:val="101820"/>
           <w:sz w:val="21"/>
         </w:rPr>
-        <w:t>iorta TechNXT may use suggestions from the Client to improve the Platform without obligation. iorta TechNXT may use technical and usage statistics that do not identify the Client, its clients or any individual, to operate and improve the Platform.</w:t>
-      </w:r>
-      <w:r>
-        <w:br w:type="page"/>
-      </w:r>
-    </w:p>
-    <w:p>
-      <w:pPr>
-        <w:pStyle w:val="Heading1"/>
-        <w:rPr/>
-      </w:pPr>
-      <w:bookmarkStart w:id="37" w:name="__RefHeading___Toc1695_460044586"/>
-      <w:bookmarkEnd w:id="37"/>
-      <w:r>
-        <w:rPr>
-          <w:rFonts w:eastAsia="Segoe UI" w:cs="Segoe UI" w:ascii="Segoe UI" w:hAnsi="Segoe UI"/>
-          <w:b/>
-          <w:color w:val="0F4761"/>
-          <w:sz w:val="32"/>
-        </w:rPr>
-        <w:t>13.  Licence grant</w:t>
-      </w:r>
-    </w:p>
-    <w:p>
-      <w:pPr>
-        <w:pStyle w:val="Normal"/>
-        <w:spacing w:lineRule="auto" w:line="276" w:before="0" w:after="120"/>
-        <w:rPr/>
-      </w:pPr>
-      <w:r>
-        <w:rPr>
-          <w:rFonts w:eastAsia="Segoe UI" w:cs="Segoe UI" w:ascii="Segoe UI" w:hAnsi="Segoe UI"/>
-          <w:color w:val="101820"/>
-          <w:sz w:val="21"/>
-        </w:rPr>
         <w:t>The right of the Client to use the Platform is granted in, and limited by, the Perpetual Software Licence Agreement or the Software Subscription Agreement named in the Order Form, for the number of Users, environments and term stated there. Use beyond that scope requires an additional Order Form.</w:t>
       </w:r>
-      <w:r>
-        <w:br w:type="page"/>
-      </w:r>
-    </w:p>
-    <w:p>
-      <w:pPr>
-        <w:pStyle w:val="Heading1"/>
-        <w:rPr/>
-      </w:pPr>
-      <w:bookmarkStart w:id="38" w:name="__RefHeading___Toc1697_460044586"/>
-      <w:bookmarkEnd w:id="38"/>
-      <w:r>
-        <w:rPr>
-          <w:rFonts w:eastAsia="Segoe UI" w:cs="Segoe UI" w:ascii="Segoe UI" w:hAnsi="Segoe UI"/>
-          <w:b/>
-          <w:color w:val="0F4761"/>
-          <w:sz w:val="32"/>
-        </w:rPr>
-        <w:t>14.  Confidentiality</w:t>
-      </w:r>
     </w:p>
     <w:p>
       <w:pPr>
         <w:pStyle w:val="Heading2"/>
         <w:rPr/>
       </w:pPr>
-      <w:bookmarkStart w:id="39" w:name="__RefHeading___Toc1699_460044586"/>
-      <w:bookmarkEnd w:id="39"/>
+      <w:bookmarkStart w:id="26" w:name="__RefHeading___Toc3679_1603226370"/>
+      <w:bookmarkEnd w:id="26"/>
       <w:r>
         <w:rPr>
           <w:rFonts w:eastAsia="Segoe UI" w:cs="Segoe UI"/>
@@ -8268,7 +7707,22 @@
           <w:color w:val="0F4761"/>
           <w:sz w:val="26"/>
         </w:rPr>
-        <w:t>14.1  Confidential Information</w:t>
+        <w:t>9.3  Confidentiality</w:t>
+      </w:r>
+    </w:p>
+    <w:p>
+      <w:pPr>
+        <w:pStyle w:val="Heading3"/>
+        <w:rPr/>
+      </w:pPr>
+      <w:r>
+        <w:rPr>
+          <w:rFonts w:eastAsia="Segoe UI" w:cs="Segoe UI"/>
+          <w:b/>
+          <w:color w:val="0F4761"/>
+          <w:sz w:val="23"/>
+        </w:rPr>
+        <w:t>9.3.1  Confidential Information</w:t>
       </w:r>
     </w:p>
     <w:p>
@@ -8288,19 +7742,17 @@
     </w:p>
     <w:p>
       <w:pPr>
-        <w:pStyle w:val="Heading2"/>
-        <w:rPr/>
-      </w:pPr>
-      <w:bookmarkStart w:id="40" w:name="__RefHeading___Toc1701_460044586"/>
-      <w:bookmarkEnd w:id="40"/>
+        <w:pStyle w:val="Heading3"/>
+        <w:rPr/>
+      </w:pPr>
       <w:r>
         <w:rPr>
           <w:rFonts w:eastAsia="Segoe UI" w:cs="Segoe UI"/>
           <w:b/>
           <w:color w:val="0F4761"/>
-          <w:sz w:val="26"/>
-        </w:rPr>
-        <w:t>14.2  Obligations</w:t>
+          <w:sz w:val="23"/>
+        </w:rPr>
+        <w:t>9.3.2  Obligations</w:t>
       </w:r>
     </w:p>
     <w:p>
@@ -8377,11 +7829,71 @@
     </w:p>
     <w:p>
       <w:pPr>
+        <w:pStyle w:val="Heading3"/>
+        <w:rPr/>
+      </w:pPr>
+      <w:r>
+        <w:rPr>
+          <w:rFonts w:eastAsia="Segoe UI" w:cs="Segoe UI"/>
+          <w:b/>
+          <w:color w:val="0F4761"/>
+          <w:sz w:val="23"/>
+        </w:rPr>
+        <w:t>9.3.3  Exceptions</w:t>
+      </w:r>
+    </w:p>
+    <w:p>
+      <w:pPr>
+        <w:pStyle w:val="Normal"/>
+        <w:spacing w:lineRule="auto" w:line="276" w:before="0" w:after="120"/>
+        <w:rPr/>
+      </w:pPr>
+      <w:r>
+        <w:rPr>
+          <w:rFonts w:eastAsia="Segoe UI" w:cs="Segoe UI" w:ascii="Segoe UI" w:hAnsi="Segoe UI"/>
+          <w:color w:val="101820"/>
+          <w:sz w:val="21"/>
+        </w:rPr>
+        <w:t>The obligations do not apply to information that: (a) is or becomes public without breach of this Agreement; (b) was lawfully known to the recipient before disclosure; (c) is received from a third party without a duty of confidence; or (d) is independently developed without use of the Confidential Information. A recipient may disclose Confidential Information when required by law, a court, the Insurance Commission, the Bureau of Internal Revenue, the National Privacy Commission or another regulator, after giving the discloser prompt notice where lawful, and only to the extent required.</w:t>
+      </w:r>
+    </w:p>
+    <w:p>
+      <w:pPr>
+        <w:pStyle w:val="Heading3"/>
+        <w:rPr/>
+      </w:pPr>
+      <w:r>
+        <w:rPr>
+          <w:rFonts w:eastAsia="Segoe UI" w:cs="Segoe UI"/>
+          <w:b/>
+          <w:color w:val="0F4761"/>
+          <w:sz w:val="23"/>
+        </w:rPr>
+        <w:t>9.3.4  Duration</w:t>
+      </w:r>
+    </w:p>
+    <w:p>
+      <w:pPr>
+        <w:pStyle w:val="Normal"/>
+        <w:spacing w:lineRule="auto" w:line="276" w:before="0" w:after="120"/>
+        <w:rPr/>
+      </w:pPr>
+      <w:r>
+        <w:rPr>
+          <w:rFonts w:eastAsia="Segoe UI" w:cs="Segoe UI" w:ascii="Segoe UI" w:hAnsi="Segoe UI"/>
+          <w:color w:val="101820"/>
+          <w:sz w:val="21"/>
+        </w:rPr>
+        <w:t>These obligations last during this Agreement and for 5 years after its termination, and for trade secrets and source code for as long as they remain trade secrets. Personal Data remains protected as stated in the Data Processing Agreement without time limit.</w:t>
+      </w:r>
+    </w:p>
+    <w:p>
+      <w:pPr>
         <w:pStyle w:val="Heading2"/>
         <w:rPr/>
       </w:pPr>
-      <w:bookmarkStart w:id="41" w:name="__RefHeading___Toc1703_460044586"/>
-      <w:bookmarkEnd w:id="41"/>
+      <w:bookmarkStart w:id="27" w:name="__RefHeading___Toc3681_1603226370"/>
+      <w:bookmarkEnd w:id="27"/>
       <w:r>
         <w:rPr>
           <w:rFonts w:eastAsia="Segoe UI" w:cs="Segoe UI"/>
@@ -8389,74 +7901,7 @@
           <w:color w:val="0F4761"/>
           <w:sz w:val="26"/>
         </w:rPr>
-        <w:t>14.3  Exceptions</w:t>
-      </w:r>
-    </w:p>
-    <w:p>
-      <w:pPr>
-        <w:pStyle w:val="Normal"/>
-        <w:spacing w:lineRule="auto" w:line="276" w:before="0" w:after="120"/>
-        <w:rPr/>
-      </w:pPr>
-      <w:r>
-        <w:rPr>
-          <w:rFonts w:eastAsia="Segoe UI" w:cs="Segoe UI" w:ascii="Segoe UI" w:hAnsi="Segoe UI"/>
-          <w:color w:val="101820"/>
-          <w:sz w:val="21"/>
-        </w:rPr>
-        <w:t>The obligations do not apply to information that: (a) is or becomes public without breach of this Agreement; (b) was lawfully known to the recipient before disclosure; (c) is received from a third party without a duty of confidence; or (d) is independently developed without use of the Confidential Information. A recipient may disclose Confidential Information when required by law, a court, the Insurance Commission, the Bureau of Internal Revenue, the National Privacy Commission or another regulator, after giving the discloser prompt notice where lawful, and only to the extent required.</w:t>
-      </w:r>
-    </w:p>
-    <w:p>
-      <w:pPr>
-        <w:pStyle w:val="Heading2"/>
-        <w:rPr/>
-      </w:pPr>
-      <w:bookmarkStart w:id="42" w:name="__RefHeading___Toc1705_460044586"/>
-      <w:bookmarkEnd w:id="42"/>
-      <w:r>
-        <w:rPr>
-          <w:rFonts w:eastAsia="Segoe UI" w:cs="Segoe UI"/>
-          <w:b/>
-          <w:color w:val="0F4761"/>
-          <w:sz w:val="26"/>
-        </w:rPr>
-        <w:t>14.4  Duration</w:t>
-      </w:r>
-    </w:p>
-    <w:p>
-      <w:pPr>
-        <w:pStyle w:val="Normal"/>
-        <w:spacing w:lineRule="auto" w:line="276" w:before="0" w:after="120"/>
-        <w:rPr/>
-      </w:pPr>
-      <w:r>
-        <w:rPr>
-          <w:rFonts w:eastAsia="Segoe UI" w:cs="Segoe UI" w:ascii="Segoe UI" w:hAnsi="Segoe UI"/>
-          <w:color w:val="101820"/>
-          <w:sz w:val="21"/>
-        </w:rPr>
-        <w:t>These obligations last during this Agreement and for 5 years after its termination, and for trade secrets and source code for as long as they remain trade secrets. Personal Data remains protected as stated in the Data Processing Agreement without time limit.</w:t>
-      </w:r>
-      <w:r>
-        <w:br w:type="page"/>
-      </w:r>
-    </w:p>
-    <w:p>
-      <w:pPr>
-        <w:pStyle w:val="Heading1"/>
-        <w:rPr/>
-      </w:pPr>
-      <w:bookmarkStart w:id="43" w:name="__RefHeading___Toc1707_460044586"/>
-      <w:bookmarkEnd w:id="43"/>
-      <w:r>
-        <w:rPr>
-          <w:rFonts w:eastAsia="Segoe UI" w:cs="Segoe UI" w:ascii="Segoe UI" w:hAnsi="Segoe UI"/>
-          <w:b/>
-          <w:color w:val="0F4761"/>
-          <w:sz w:val="32"/>
-        </w:rPr>
-        <w:t>15.  Data protection</w:t>
+        <w:t>9.4  Data protection</w:t>
       </w:r>
     </w:p>
     <w:p>
@@ -8562,8 +8007,8 @@
         <w:pStyle w:val="Heading1"/>
         <w:rPr/>
       </w:pPr>
-      <w:bookmarkStart w:id="44" w:name="__RefHeading___Toc1709_460044586"/>
-      <w:bookmarkEnd w:id="44"/>
+      <w:bookmarkStart w:id="28" w:name="__RefHeading___Toc3683_1603226370"/>
+      <w:bookmarkEnd w:id="28"/>
       <w:r>
         <w:rPr>
           <w:rFonts w:eastAsia="Segoe UI" w:cs="Segoe UI" w:ascii="Segoe UI" w:hAnsi="Segoe UI"/>
@@ -8571,7 +8016,7 @@
           <w:color w:val="0F4761"/>
           <w:sz w:val="32"/>
         </w:rPr>
-        <w:t>16.  Warranties</w:t>
+        <w:t>10.  Warranties, liability and indemnities</w:t>
       </w:r>
     </w:p>
     <w:p>
@@ -8579,8 +8024,8 @@
         <w:pStyle w:val="Heading2"/>
         <w:rPr/>
       </w:pPr>
-      <w:bookmarkStart w:id="45" w:name="__RefHeading___Toc1711_460044586"/>
-      <w:bookmarkEnd w:id="45"/>
+      <w:bookmarkStart w:id="29" w:name="__RefHeading___Toc3685_1603226370"/>
+      <w:bookmarkEnd w:id="29"/>
       <w:r>
         <w:rPr>
           <w:rFonts w:eastAsia="Segoe UI" w:cs="Segoe UI"/>
@@ -8588,7 +8033,22 @@
           <w:color w:val="0F4761"/>
           <w:sz w:val="26"/>
         </w:rPr>
-        <w:t>16.1  Mutual warranties</w:t>
+        <w:t>10.1  Warranties</w:t>
+      </w:r>
+    </w:p>
+    <w:p>
+      <w:pPr>
+        <w:pStyle w:val="Heading3"/>
+        <w:rPr/>
+      </w:pPr>
+      <w:r>
+        <w:rPr>
+          <w:rFonts w:eastAsia="Segoe UI" w:cs="Segoe UI"/>
+          <w:b/>
+          <w:color w:val="0F4761"/>
+          <w:sz w:val="23"/>
+        </w:rPr>
+        <w:t>10.1.1  Mutual warranties</w:t>
       </w:r>
     </w:p>
     <w:p>
@@ -8608,19 +8068,17 @@
     </w:p>
     <w:p>
       <w:pPr>
-        <w:pStyle w:val="Heading2"/>
-        <w:rPr/>
-      </w:pPr>
-      <w:bookmarkStart w:id="46" w:name="__RefHeading___Toc1713_460044586"/>
-      <w:bookmarkEnd w:id="46"/>
+        <w:pStyle w:val="Heading3"/>
+        <w:rPr/>
+      </w:pPr>
       <w:r>
         <w:rPr>
           <w:rFonts w:eastAsia="Segoe UI" w:cs="Segoe UI"/>
           <w:b/>
           <w:color w:val="0F4761"/>
-          <w:sz w:val="26"/>
-        </w:rPr>
-        <w:t>16.2  iorta TechNXT warranties</w:t>
+          <w:sz w:val="23"/>
+        </w:rPr>
+        <w:t>10.1.2  iorta TechNXT warranties</w:t>
       </w:r>
     </w:p>
     <w:p>
@@ -8716,11 +8174,101 @@
     </w:p>
     <w:p>
       <w:pPr>
+        <w:pStyle w:val="Heading3"/>
+        <w:rPr/>
+      </w:pPr>
+      <w:r>
+        <w:rPr>
+          <w:rFonts w:eastAsia="Segoe UI" w:cs="Segoe UI"/>
+          <w:b/>
+          <w:color w:val="0F4761"/>
+          <w:sz w:val="23"/>
+        </w:rPr>
+        <w:t>10.1.3  Remedies</w:t>
+      </w:r>
+    </w:p>
+    <w:p>
+      <w:pPr>
+        <w:pStyle w:val="Normal"/>
+        <w:spacing w:lineRule="auto" w:line="276" w:before="0" w:after="120"/>
+        <w:rPr/>
+      </w:pPr>
+      <w:r>
+        <w:rPr>
+          <w:rFonts w:eastAsia="Segoe UI" w:cs="Segoe UI" w:ascii="Segoe UI" w:hAnsi="Segoe UI"/>
+          <w:color w:val="101820"/>
+          <w:sz w:val="21"/>
+        </w:rPr>
+        <w:t>If the Platform does not meet the warranty in point 2 above, iorta TechNXT will, at its option and cost, correct the defect, provide a workaround or, if it cannot do either in a reasonable time, the Client may terminate the affected Order Form and receive a refund of the licence or subscription Fees paid for the period of non-conformity. This is the Client's sole remedy for breach of that warranty.</w:t>
+      </w:r>
+    </w:p>
+    <w:p>
+      <w:pPr>
+        <w:pStyle w:val="Heading3"/>
+        <w:rPr/>
+      </w:pPr>
+      <w:r>
+        <w:rPr>
+          <w:rFonts w:eastAsia="Segoe UI" w:cs="Segoe UI"/>
+          <w:b/>
+          <w:color w:val="0F4761"/>
+          <w:sz w:val="23"/>
+        </w:rPr>
+        <w:t>10.1.4  Exclusions</w:t>
+      </w:r>
+    </w:p>
+    <w:p>
+      <w:pPr>
+        <w:pStyle w:val="Normal"/>
+        <w:spacing w:lineRule="auto" w:line="276" w:before="0" w:after="120"/>
+        <w:rPr/>
+      </w:pPr>
+      <w:r>
+        <w:rPr>
+          <w:rFonts w:eastAsia="Segoe UI" w:cs="Segoe UI" w:ascii="Segoe UI" w:hAnsi="Segoe UI"/>
+          <w:color w:val="101820"/>
+          <w:sz w:val="21"/>
+        </w:rPr>
+        <w:t>The warranties do not apply to defects caused by: use not in line with the Documentation; changes not made by iorta TechNXT; the Client's data, systems, network or third-party products; or use of a release more than two planned releases behind the current one.</w:t>
+      </w:r>
+    </w:p>
+    <w:p>
+      <w:pPr>
+        <w:pStyle w:val="Heading3"/>
+        <w:rPr/>
+      </w:pPr>
+      <w:r>
+        <w:rPr>
+          <w:rFonts w:eastAsia="Segoe UI" w:cs="Segoe UI"/>
+          <w:b/>
+          <w:color w:val="0F4761"/>
+          <w:sz w:val="23"/>
+        </w:rPr>
+        <w:t>10.1.5  Disclaimer</w:t>
+      </w:r>
+    </w:p>
+    <w:p>
+      <w:pPr>
+        <w:pStyle w:val="Normal"/>
+        <w:spacing w:lineRule="auto" w:line="276" w:before="0" w:after="120"/>
+        <w:rPr/>
+      </w:pPr>
+      <w:r>
+        <w:rPr>
+          <w:rFonts w:eastAsia="Segoe UI" w:cs="Segoe UI" w:ascii="Segoe UI" w:hAnsi="Segoe UI"/>
+          <w:color w:val="101820"/>
+          <w:sz w:val="21"/>
+        </w:rPr>
+        <w:t>Except as stated in this Agreement, and to the extent permitted by law, iorta TechNXT gives no other warranty, express or implied, including any warranty that the Platform will be error-free or uninterrupted, or that it meets requirements that are not in the Documentation or the SOW. The Platform supports the Client's compliance with the laws and regulations that apply to it but does not replace the Client's own legal, tax, actuarial and compliance judgement.</w:t>
+      </w:r>
+    </w:p>
+    <w:p>
+      <w:pPr>
         <w:pStyle w:val="Heading2"/>
         <w:rPr/>
       </w:pPr>
-      <w:bookmarkStart w:id="47" w:name="__RefHeading___Toc1715_460044586"/>
-      <w:bookmarkEnd w:id="47"/>
+      <w:bookmarkStart w:id="30" w:name="__RefHeading___Toc3687_1603226370"/>
+      <w:bookmarkEnd w:id="30"/>
       <w:r>
         <w:rPr>
           <w:rFonts w:eastAsia="Segoe UI" w:cs="Segoe UI"/>
@@ -8728,106 +8276,7 @@
           <w:color w:val="0F4761"/>
           <w:sz w:val="26"/>
         </w:rPr>
-        <w:t>16.3  Remedies</w:t>
-      </w:r>
-    </w:p>
-    <w:p>
-      <w:pPr>
-        <w:pStyle w:val="Normal"/>
-        <w:spacing w:lineRule="auto" w:line="276" w:before="0" w:after="120"/>
-        <w:rPr/>
-      </w:pPr>
-      <w:r>
-        <w:rPr>
-          <w:rFonts w:eastAsia="Segoe UI" w:cs="Segoe UI" w:ascii="Segoe UI" w:hAnsi="Segoe UI"/>
-          <w:color w:val="101820"/>
-          <w:sz w:val="21"/>
-        </w:rPr>
-        <w:t>If the Platform does not meet the warranty in point 2 above, iorta TechNXT will, at its option and cost, correct the defect, provide a workaround or, if it cannot do either in a reasonable time, the Client may terminate the affected Order Form and receive a refund of the licence or subscription Fees paid for the period of non-conformity. This is the Client's sole remedy for breach of that warranty.</w:t>
-      </w:r>
-    </w:p>
-    <w:p>
-      <w:pPr>
-        <w:pStyle w:val="Heading2"/>
-        <w:rPr/>
-      </w:pPr>
-      <w:bookmarkStart w:id="48" w:name="__RefHeading___Toc1717_460044586"/>
-      <w:bookmarkEnd w:id="48"/>
-      <w:r>
-        <w:rPr>
-          <w:rFonts w:eastAsia="Segoe UI" w:cs="Segoe UI"/>
-          <w:b/>
-          <w:color w:val="0F4761"/>
-          <w:sz w:val="26"/>
-        </w:rPr>
-        <w:t>16.4  Exclusions</w:t>
-      </w:r>
-    </w:p>
-    <w:p>
-      <w:pPr>
-        <w:pStyle w:val="Normal"/>
-        <w:spacing w:lineRule="auto" w:line="276" w:before="0" w:after="120"/>
-        <w:rPr/>
-      </w:pPr>
-      <w:r>
-        <w:rPr>
-          <w:rFonts w:eastAsia="Segoe UI" w:cs="Segoe UI" w:ascii="Segoe UI" w:hAnsi="Segoe UI"/>
-          <w:color w:val="101820"/>
-          <w:sz w:val="21"/>
-        </w:rPr>
-        <w:t>The warranties do not apply to defects caused by: use not in line with the Documentation; changes not made by iorta TechNXT; the Client's data, systems, network or third-party products; or use of a release more than two planned releases behind the current one.</w:t>
-      </w:r>
-    </w:p>
-    <w:p>
-      <w:pPr>
-        <w:pStyle w:val="Heading2"/>
-        <w:rPr/>
-      </w:pPr>
-      <w:bookmarkStart w:id="49" w:name="__RefHeading___Toc1719_460044586"/>
-      <w:bookmarkEnd w:id="49"/>
-      <w:r>
-        <w:rPr>
-          <w:rFonts w:eastAsia="Segoe UI" w:cs="Segoe UI"/>
-          <w:b/>
-          <w:color w:val="0F4761"/>
-          <w:sz w:val="26"/>
-        </w:rPr>
-        <w:t>16.5  Disclaimer</w:t>
-      </w:r>
-    </w:p>
-    <w:p>
-      <w:pPr>
-        <w:pStyle w:val="Normal"/>
-        <w:spacing w:lineRule="auto" w:line="276" w:before="0" w:after="120"/>
-        <w:rPr/>
-      </w:pPr>
-      <w:r>
-        <w:rPr>
-          <w:rFonts w:eastAsia="Segoe UI" w:cs="Segoe UI" w:ascii="Segoe UI" w:hAnsi="Segoe UI"/>
-          <w:color w:val="101820"/>
-          <w:sz w:val="21"/>
-        </w:rPr>
-        <w:t>Except as stated in this Agreement, and to the extent permitted by law, iorta TechNXT gives no other warranty, express or implied, including any warranty that the Platform will be error-free or uninterrupted, or that it meets requirements that are not in the Documentation or the SOW. The Platform supports the Client's compliance with the laws and regulations that apply to it but does not replace the Client's own legal, tax, actuarial and compliance judgement.</w:t>
-      </w:r>
-      <w:r>
-        <w:br w:type="page"/>
-      </w:r>
-    </w:p>
-    <w:p>
-      <w:pPr>
-        <w:pStyle w:val="Heading1"/>
-        <w:rPr/>
-      </w:pPr>
-      <w:bookmarkStart w:id="50" w:name="__RefHeading___Toc1721_460044586"/>
-      <w:bookmarkEnd w:id="50"/>
-      <w:r>
-        <w:rPr>
-          <w:rFonts w:eastAsia="Segoe UI" w:cs="Segoe UI" w:ascii="Segoe UI" w:hAnsi="Segoe UI"/>
-          <w:b/>
-          <w:color w:val="0F4761"/>
-          <w:sz w:val="32"/>
-        </w:rPr>
-        <w:t>17.  Limitation of liability</w:t>
+        <w:t>10.2  Limitation of liability</w:t>
       </w:r>
     </w:p>
     <w:p>
@@ -8924,34 +8373,14 @@
         </w:rPr>
         <w:t>Each Party must take reasonable steps to mitigate its loss.</w:t>
       </w:r>
-      <w:r>
-        <w:br w:type="page"/>
-      </w:r>
-    </w:p>
-    <w:p>
-      <w:pPr>
-        <w:pStyle w:val="Heading1"/>
-        <w:rPr/>
-      </w:pPr>
-      <w:bookmarkStart w:id="51" w:name="__RefHeading___Toc1723_460044586"/>
-      <w:bookmarkEnd w:id="51"/>
-      <w:r>
-        <w:rPr>
-          <w:rFonts w:eastAsia="Segoe UI" w:cs="Segoe UI" w:ascii="Segoe UI" w:hAnsi="Segoe UI"/>
-          <w:b/>
-          <w:color w:val="0F4761"/>
-          <w:sz w:val="32"/>
-        </w:rPr>
-        <w:t>18.  Indemnities</w:t>
-      </w:r>
     </w:p>
     <w:p>
       <w:pPr>
         <w:pStyle w:val="Heading2"/>
         <w:rPr/>
       </w:pPr>
-      <w:bookmarkStart w:id="52" w:name="__RefHeading___Toc1725_460044586"/>
-      <w:bookmarkEnd w:id="52"/>
+      <w:bookmarkStart w:id="31" w:name="__RefHeading___Toc3689_1603226370"/>
+      <w:bookmarkEnd w:id="31"/>
       <w:r>
         <w:rPr>
           <w:rFonts w:eastAsia="Segoe UI" w:cs="Segoe UI"/>
@@ -8959,7 +8388,22 @@
           <w:color w:val="0F4761"/>
           <w:sz w:val="26"/>
         </w:rPr>
-        <w:t>18.1  Intellectual property indemnity</w:t>
+        <w:t>10.3  Indemnities</w:t>
+      </w:r>
+    </w:p>
+    <w:p>
+      <w:pPr>
+        <w:pStyle w:val="Heading3"/>
+        <w:rPr/>
+      </w:pPr>
+      <w:r>
+        <w:rPr>
+          <w:rFonts w:eastAsia="Segoe UI" w:cs="Segoe UI"/>
+          <w:b/>
+          <w:color w:val="0F4761"/>
+          <w:sz w:val="23"/>
+        </w:rPr>
+        <w:t>10.3.1  Intellectual property indemnity</w:t>
       </w:r>
     </w:p>
     <w:p>
@@ -9021,11 +8465,91 @@
     </w:p>
     <w:p>
       <w:pPr>
+        <w:pStyle w:val="Heading3"/>
+        <w:rPr/>
+      </w:pPr>
+      <w:r>
+        <w:rPr>
+          <w:rFonts w:eastAsia="Segoe UI" w:cs="Segoe UI"/>
+          <w:b/>
+          <w:color w:val="0F4761"/>
+          <w:sz w:val="23"/>
+        </w:rPr>
+        <w:t>10.3.2  Client indemnity</w:t>
+      </w:r>
+    </w:p>
+    <w:p>
+      <w:pPr>
+        <w:pStyle w:val="Normal"/>
+        <w:spacing w:lineRule="auto" w:line="276" w:before="0" w:after="120"/>
+        <w:rPr/>
+      </w:pPr>
+      <w:r>
+        <w:rPr>
+          <w:rFonts w:eastAsia="Segoe UI" w:cs="Segoe UI" w:ascii="Segoe UI" w:hAnsi="Segoe UI"/>
+          <w:color w:val="101820"/>
+          <w:sz w:val="21"/>
+        </w:rPr>
+        <w:t>The Client shall defend iorta TechNXT against any third-party claim arising from Client Data, the Client's use of the Platform in breach of law or of this Agreement, or the Client's dealings with its own clients, insurers and regulators, and shall pay the damages and costs finally awarded or agreed in settlement.</w:t>
+      </w:r>
+    </w:p>
+    <w:p>
+      <w:pPr>
+        <w:pStyle w:val="Heading3"/>
+        <w:rPr/>
+      </w:pPr>
+      <w:r>
+        <w:rPr>
+          <w:rFonts w:eastAsia="Segoe UI" w:cs="Segoe UI"/>
+          <w:b/>
+          <w:color w:val="0F4761"/>
+          <w:sz w:val="23"/>
+        </w:rPr>
+        <w:t>10.3.3  Procedure</w:t>
+      </w:r>
+    </w:p>
+    <w:p>
+      <w:pPr>
+        <w:pStyle w:val="Normal"/>
+        <w:spacing w:lineRule="auto" w:line="276" w:before="0" w:after="120"/>
+        <w:rPr/>
+      </w:pPr>
+      <w:r>
+        <w:rPr>
+          <w:rFonts w:eastAsia="Segoe UI" w:cs="Segoe UI" w:ascii="Segoe UI" w:hAnsi="Segoe UI"/>
+          <w:color w:val="101820"/>
+          <w:sz w:val="21"/>
+        </w:rPr>
+        <w:t>The indemnified Party notifies the claim promptly in writing, gives the indemnifying Party sole control of the defence and settlement (no settlement may admit fault of the indemnified Party without its consent), and provides reasonable cooperation at the indemnifying Party's cost.</w:t>
+      </w:r>
+      <w:r>
+        <w:br w:type="page"/>
+      </w:r>
+    </w:p>
+    <w:p>
+      <w:pPr>
+        <w:pStyle w:val="Heading1"/>
+        <w:rPr/>
+      </w:pPr>
+      <w:bookmarkStart w:id="32" w:name="__RefHeading___Toc3691_1603226370"/>
+      <w:bookmarkEnd w:id="32"/>
+      <w:r>
+        <w:rPr>
+          <w:rFonts w:eastAsia="Segoe UI" w:cs="Segoe UI" w:ascii="Segoe UI" w:hAnsi="Segoe UI"/>
+          <w:b/>
+          <w:color w:val="0F4761"/>
+          <w:sz w:val="32"/>
+        </w:rPr>
+        <w:t>11.  Other terms</w:t>
+      </w:r>
+    </w:p>
+    <w:p>
+      <w:pPr>
         <w:pStyle w:val="Heading2"/>
         <w:rPr/>
       </w:pPr>
-      <w:bookmarkStart w:id="53" w:name="__RefHeading___Toc1727_460044586"/>
-      <w:bookmarkEnd w:id="53"/>
+      <w:bookmarkStart w:id="33" w:name="__RefHeading___Toc3693_1603226370"/>
+      <w:bookmarkEnd w:id="33"/>
       <w:r>
         <w:rPr>
           <w:rFonts w:eastAsia="Segoe UI" w:cs="Segoe UI"/>
@@ -9033,74 +8557,7 @@
           <w:color w:val="0F4761"/>
           <w:sz w:val="26"/>
         </w:rPr>
-        <w:t>18.2  Client indemnity</w:t>
-      </w:r>
-    </w:p>
-    <w:p>
-      <w:pPr>
-        <w:pStyle w:val="Normal"/>
-        <w:spacing w:lineRule="auto" w:line="276" w:before="0" w:after="120"/>
-        <w:rPr/>
-      </w:pPr>
-      <w:r>
-        <w:rPr>
-          <w:rFonts w:eastAsia="Segoe UI" w:cs="Segoe UI" w:ascii="Segoe UI" w:hAnsi="Segoe UI"/>
-          <w:color w:val="101820"/>
-          <w:sz w:val="21"/>
-        </w:rPr>
-        <w:t>The Client shall defend iorta TechNXT against any third-party claim arising from Client Data, the Client's use of the Platform in breach of law or of this Agreement, or the Client's dealings with its own clients, insurers and regulators, and shall pay the damages and costs finally awarded or agreed in settlement.</w:t>
-      </w:r>
-    </w:p>
-    <w:p>
-      <w:pPr>
-        <w:pStyle w:val="Heading2"/>
-        <w:rPr/>
-      </w:pPr>
-      <w:bookmarkStart w:id="54" w:name="__RefHeading___Toc1729_460044586"/>
-      <w:bookmarkEnd w:id="54"/>
-      <w:r>
-        <w:rPr>
-          <w:rFonts w:eastAsia="Segoe UI" w:cs="Segoe UI"/>
-          <w:b/>
-          <w:color w:val="0F4761"/>
-          <w:sz w:val="26"/>
-        </w:rPr>
-        <w:t>18.3  Procedure</w:t>
-      </w:r>
-    </w:p>
-    <w:p>
-      <w:pPr>
-        <w:pStyle w:val="Normal"/>
-        <w:spacing w:lineRule="auto" w:line="276" w:before="0" w:after="120"/>
-        <w:rPr/>
-      </w:pPr>
-      <w:r>
-        <w:rPr>
-          <w:rFonts w:eastAsia="Segoe UI" w:cs="Segoe UI" w:ascii="Segoe UI" w:hAnsi="Segoe UI"/>
-          <w:color w:val="101820"/>
-          <w:sz w:val="21"/>
-        </w:rPr>
-        <w:t>The indemnified Party notifies the claim promptly in writing, gives the indemnifying Party sole control of the defence and settlement (no settlement may admit fault of the indemnified Party without its consent), and provides reasonable cooperation at the indemnifying Party's cost.</w:t>
-      </w:r>
-      <w:r>
-        <w:br w:type="page"/>
-      </w:r>
-    </w:p>
-    <w:p>
-      <w:pPr>
-        <w:pStyle w:val="Heading1"/>
-        <w:rPr/>
-      </w:pPr>
-      <w:bookmarkStart w:id="55" w:name="__RefHeading___Toc1731_460044586"/>
-      <w:bookmarkEnd w:id="55"/>
-      <w:r>
-        <w:rPr>
-          <w:rFonts w:eastAsia="Segoe UI" w:cs="Segoe UI" w:ascii="Segoe UI" w:hAnsi="Segoe UI"/>
-          <w:b/>
-          <w:color w:val="0F4761"/>
-          <w:sz w:val="32"/>
-        </w:rPr>
-        <w:t>19.  Force majeure</w:t>
+        <w:t>11.1  Force majeure</w:t>
       </w:r>
     </w:p>
     <w:p>
@@ -9178,25 +8635,22 @@
         </w:rPr>
         <w:t>If the event continues for more than 60 days, either Party may terminate the affected Order Form by written notice, with payment for Services performed up to termination.</w:t>
       </w:r>
-      <w:r>
-        <w:br w:type="page"/>
-      </w:r>
-    </w:p>
-    <w:p>
-      <w:pPr>
-        <w:pStyle w:val="Heading1"/>
-        <w:rPr/>
-      </w:pPr>
-      <w:bookmarkStart w:id="56" w:name="__RefHeading___Toc1733_460044586"/>
-      <w:bookmarkEnd w:id="56"/>
-      <w:r>
-        <w:rPr>
-          <w:rFonts w:eastAsia="Segoe UI" w:cs="Segoe UI" w:ascii="Segoe UI" w:hAnsi="Segoe UI"/>
+    </w:p>
+    <w:p>
+      <w:pPr>
+        <w:pStyle w:val="Heading2"/>
+        <w:rPr/>
+      </w:pPr>
+      <w:bookmarkStart w:id="34" w:name="__RefHeading___Toc3695_1603226370"/>
+      <w:bookmarkEnd w:id="34"/>
+      <w:r>
+        <w:rPr>
+          <w:rFonts w:eastAsia="Segoe UI" w:cs="Segoe UI"/>
           <w:b/>
           <w:color w:val="0F4761"/>
-          <w:sz w:val="32"/>
-        </w:rPr>
-        <w:t>20.  Non-solicitation</w:t>
+          <w:sz w:val="26"/>
+        </w:rPr>
+        <w:t>11.2  Non-solicitation</w:t>
       </w:r>
     </w:p>
     <w:p>
@@ -9213,25 +8667,22 @@
         </w:rPr>
         <w:t>During the term of an Order Form and for 12 months after it ends, neither Party shall, directly or indirectly, solicit for employment or engage any employee of the other Party who was involved in the Services, without the other Party's written consent. General advertisements not aimed at those employees are not a breach. If a Party breaches this clause, it pays the other Party, as liquidated damages and not as a penalty, an amount equal to [six months'] gross salary of the person concerned at the time of leaving.</w:t>
       </w:r>
-      <w:r>
-        <w:br w:type="page"/>
-      </w:r>
-    </w:p>
-    <w:p>
-      <w:pPr>
-        <w:pStyle w:val="Heading1"/>
-        <w:rPr/>
-      </w:pPr>
-      <w:bookmarkStart w:id="57" w:name="__RefHeading___Toc1735_460044586"/>
-      <w:bookmarkEnd w:id="57"/>
-      <w:r>
-        <w:rPr>
-          <w:rFonts w:eastAsia="Segoe UI" w:cs="Segoe UI" w:ascii="Segoe UI" w:hAnsi="Segoe UI"/>
+    </w:p>
+    <w:p>
+      <w:pPr>
+        <w:pStyle w:val="Heading2"/>
+        <w:rPr/>
+      </w:pPr>
+      <w:bookmarkStart w:id="35" w:name="__RefHeading___Toc3697_1603226370"/>
+      <w:bookmarkEnd w:id="35"/>
+      <w:r>
+        <w:rPr>
+          <w:rFonts w:eastAsia="Segoe UI" w:cs="Segoe UI"/>
           <w:b/>
           <w:color w:val="0F4761"/>
-          <w:sz w:val="32"/>
-        </w:rPr>
-        <w:t>21.  Assignment and subcontracting</w:t>
+          <w:sz w:val="26"/>
+        </w:rPr>
+        <w:t>11.3  Assignment and subcontracting</w:t>
       </w:r>
     </w:p>
     <w:p>
@@ -9288,27 +8739,7 @@
           <w:color w:val="101820"/>
           <w:sz w:val="21"/>
         </w:rPr>
-        <w:t>Subcontracting is governed by the Subcontractors section of the Services clause.</w:t>
-      </w:r>
-      <w:r>
-        <w:br w:type="page"/>
-      </w:r>
-    </w:p>
-    <w:p>
-      <w:pPr>
-        <w:pStyle w:val="Heading1"/>
-        <w:rPr/>
-      </w:pPr>
-      <w:bookmarkStart w:id="58" w:name="__RefHeading___Toc1737_460044586"/>
-      <w:bookmarkEnd w:id="58"/>
-      <w:r>
-        <w:rPr>
-          <w:rFonts w:eastAsia="Segoe UI" w:cs="Segoe UI" w:ascii="Segoe UI" w:hAnsi="Segoe UI"/>
-          <w:b/>
-          <w:color w:val="0F4761"/>
-          <w:sz w:val="32"/>
-        </w:rPr>
-        <w:t>22.  Dispute resolution</w:t>
+        <w:t>Subcontracting is governed by the Subcontractors part of the Scope of services clause.</w:t>
       </w:r>
     </w:p>
     <w:p>
@@ -9316,8 +8747,8 @@
         <w:pStyle w:val="Heading2"/>
         <w:rPr/>
       </w:pPr>
-      <w:bookmarkStart w:id="59" w:name="__RefHeading___Toc1739_460044586"/>
-      <w:bookmarkEnd w:id="59"/>
+      <w:bookmarkStart w:id="36" w:name="__RefHeading___Toc3699_1603226370"/>
+      <w:bookmarkEnd w:id="36"/>
       <w:r>
         <w:rPr>
           <w:rFonts w:eastAsia="Segoe UI" w:cs="Segoe UI"/>
@@ -9325,7 +8756,22 @@
           <w:color w:val="0F4761"/>
           <w:sz w:val="26"/>
         </w:rPr>
-        <w:t>22.1  Negotiation</w:t>
+        <w:t>11.4  Dispute resolution</w:t>
+      </w:r>
+    </w:p>
+    <w:p>
+      <w:pPr>
+        <w:pStyle w:val="Heading3"/>
+        <w:rPr/>
+      </w:pPr>
+      <w:r>
+        <w:rPr>
+          <w:rFonts w:eastAsia="Segoe UI" w:cs="Segoe UI"/>
+          <w:b/>
+          <w:color w:val="0F4761"/>
+          <w:sz w:val="23"/>
+        </w:rPr>
+        <w:t>11.4.1  Negotiation</w:t>
       </w:r>
     </w:p>
     <w:p>
@@ -9345,11 +8791,116 @@
     </w:p>
     <w:p>
       <w:pPr>
+        <w:pStyle w:val="Heading3"/>
+        <w:rPr/>
+      </w:pPr>
+      <w:r>
+        <w:rPr>
+          <w:rFonts w:eastAsia="Segoe UI" w:cs="Segoe UI"/>
+          <w:b/>
+          <w:color w:val="0F4761"/>
+          <w:sz w:val="23"/>
+        </w:rPr>
+        <w:t>11.4.2  Mediation</w:t>
+      </w:r>
+    </w:p>
+    <w:p>
+      <w:pPr>
+        <w:pStyle w:val="Normal"/>
+        <w:spacing w:lineRule="auto" w:line="276" w:before="0" w:after="120"/>
+        <w:rPr/>
+      </w:pPr>
+      <w:r>
+        <w:rPr>
+          <w:rFonts w:eastAsia="Segoe UI" w:cs="Segoe UI" w:ascii="Segoe UI" w:hAnsi="Segoe UI"/>
+          <w:color w:val="101820"/>
+          <w:sz w:val="21"/>
+        </w:rPr>
+        <w:t>If the senior executives do not resolve the dispute within 30 days of the referral, either Party may refer it to mediation administered by [the Philippine Dispute Resolution Center, Inc. (PDRC) under its mediation rules / a mediator agreed by the Parties], in line with RA 9285 (Alternative Dispute Resolution Act of 2004). The mediation takes place in [Makati City / Taguig City], in English. Each Party bears its own costs and half of the mediator's fees.</w:t>
+      </w:r>
+    </w:p>
+    <w:p>
+      <w:pPr>
+        <w:pStyle w:val="Heading3"/>
+        <w:rPr/>
+      </w:pPr>
+      <w:r>
+        <w:rPr>
+          <w:rFonts w:eastAsia="Segoe UI" w:cs="Segoe UI"/>
+          <w:b/>
+          <w:color w:val="0F4761"/>
+          <w:sz w:val="23"/>
+        </w:rPr>
+        <w:t>11.4.3  Final resolution: choose one option</w:t>
+      </w:r>
+    </w:p>
+    <w:p>
+      <w:pPr>
+        <w:pStyle w:val="Normal"/>
+        <w:spacing w:lineRule="auto" w:line="276" w:before="0" w:after="120"/>
+        <w:rPr/>
+      </w:pPr>
+      <w:r>
+        <w:rPr>
+          <w:rFonts w:eastAsia="Segoe UI" w:cs="Segoe UI" w:ascii="Segoe UI" w:hAnsi="Segoe UI"/>
+          <w:color w:val="101820"/>
+          <w:sz w:val="21"/>
+        </w:rPr>
+        <w:t>[Option A: Arbitration. If the dispute is not settled within 60 days of the start of mediation, it shall be finally resolved by arbitration administered by the Philippine Dispute Resolution Center, Inc. under its arbitration rules in force at the time. The seat of arbitration is [Makati City], Philippines. The tribunal consists of [one arbitrator / three arbitrators]. The language is English. The award is final and binding and may be enforced in any competent court under RA 9285 and RA 876 (Arbitration Law).]</w:t>
+      </w:r>
+    </w:p>
+    <w:p>
+      <w:pPr>
+        <w:pStyle w:val="Normal"/>
+        <w:spacing w:lineRule="auto" w:line="276" w:before="0" w:after="120"/>
+        <w:rPr/>
+      </w:pPr>
+      <w:r>
+        <w:rPr>
+          <w:rFonts w:eastAsia="Segoe UI" w:cs="Segoe UI" w:ascii="Segoe UI" w:hAnsi="Segoe UI"/>
+          <w:color w:val="101820"/>
+          <w:sz w:val="21"/>
+        </w:rPr>
+        <w:t>[Option B: Courts. If the dispute is not settled within 60 days of the start of mediation, it shall be submitted to the proper courts of [Makati City / Taguig City], Philippines, to the exclusion of all other venues.]</w:t>
+      </w:r>
+    </w:p>
+    <w:p>
+      <w:pPr>
+        <w:pStyle w:val="Heading3"/>
+        <w:rPr/>
+      </w:pPr>
+      <w:r>
+        <w:rPr>
+          <w:rFonts w:eastAsia="Segoe UI" w:cs="Segoe UI"/>
+          <w:b/>
+          <w:color w:val="0F4761"/>
+          <w:sz w:val="23"/>
+        </w:rPr>
+        <w:t>11.4.4  Interim relief and continued performance</w:t>
+      </w:r>
+    </w:p>
+    <w:p>
+      <w:pPr>
+        <w:pStyle w:val="Normal"/>
+        <w:spacing w:lineRule="auto" w:line="276" w:before="0" w:after="120"/>
+        <w:rPr/>
+      </w:pPr>
+      <w:r>
+        <w:rPr>
+          <w:rFonts w:eastAsia="Segoe UI" w:cs="Segoe UI" w:ascii="Segoe UI" w:hAnsi="Segoe UI"/>
+          <w:color w:val="101820"/>
+          <w:sz w:val="21"/>
+        </w:rPr>
+        <w:t>Nothing in this clause prevents a Party from seeking urgent interim relief from a competent court to protect its Confidential Information or Intellectual Property Rights. Unless the Agreement is terminated, the Parties continue to perform their obligations during the dispute, and iorta TechNXT does not suspend Services for an amount the Client disputes in good faith under the Fees and payment clause.</w:t>
+      </w:r>
+    </w:p>
+    <w:p>
+      <w:pPr>
         <w:pStyle w:val="Heading2"/>
         <w:rPr/>
       </w:pPr>
-      <w:bookmarkStart w:id="60" w:name="__RefHeading___Toc1741_460044586"/>
-      <w:bookmarkEnd w:id="60"/>
+      <w:bookmarkStart w:id="37" w:name="__RefHeading___Toc3701_1603226370"/>
+      <w:bookmarkEnd w:id="37"/>
       <w:r>
         <w:rPr>
           <w:rFonts w:eastAsia="Segoe UI" w:cs="Segoe UI"/>
@@ -9357,7 +8908,7 @@
           <w:color w:val="0F4761"/>
           <w:sz w:val="26"/>
         </w:rPr>
-        <w:t>22.2  Mediation</w:t>
+        <w:t>11.5  Governing law</w:t>
       </w:r>
     </w:p>
     <w:p>
@@ -9372,7 +8923,7 @@
           <w:color w:val="101820"/>
           <w:sz w:val="21"/>
         </w:rPr>
-        <w:t>If the senior executives do not resolve the dispute within 30 days of the referral, either Party may refer it to mediation administered by [the Philippine Dispute Resolution Center, Inc. (PDRC) under its mediation rules / a mediator agreed by the Parties], in line with RA 9285 (Alternative Dispute Resolution Act of 2004). The mediation takes place in [Makati City / Taguig City], in English. Each Party bears its own costs and half of the mediator's fees.</w:t>
+        <w:t>This Agreement and every Order Form are governed by and construed in accordance with the laws of the Republic of the Philippines.</w:t>
       </w:r>
     </w:p>
     <w:p>
@@ -9380,8 +8931,8 @@
         <w:pStyle w:val="Heading2"/>
         <w:rPr/>
       </w:pPr>
-      <w:bookmarkStart w:id="61" w:name="__RefHeading___Toc1743_460044586"/>
-      <w:bookmarkEnd w:id="61"/>
+      <w:bookmarkStart w:id="38" w:name="__RefHeading___Toc3703_1603226370"/>
+      <w:bookmarkEnd w:id="38"/>
       <w:r>
         <w:rPr>
           <w:rFonts w:eastAsia="Segoe UI" w:cs="Segoe UI"/>
@@ -9389,124 +8940,7 @@
           <w:color w:val="0F4761"/>
           <w:sz w:val="26"/>
         </w:rPr>
-        <w:t>22.3  Final resolution: choose one option</w:t>
-      </w:r>
-    </w:p>
-    <w:p>
-      <w:pPr>
-        <w:pStyle w:val="Normal"/>
-        <w:spacing w:lineRule="auto" w:line="276" w:before="0" w:after="120"/>
-        <w:rPr/>
-      </w:pPr>
-      <w:r>
-        <w:rPr>
-          <w:rFonts w:eastAsia="Segoe UI" w:cs="Segoe UI" w:ascii="Segoe UI" w:hAnsi="Segoe UI"/>
-          <w:color w:val="101820"/>
-          <w:sz w:val="21"/>
-        </w:rPr>
-        <w:t>[Option A: Arbitration. If the dispute is not settled within 60 days of the start of mediation, it shall be finally resolved by arbitration administered by the Philippine Dispute Resolution Center, Inc. under its arbitration rules in force at the time. The seat of arbitration is [Makati City], Philippines. The tribunal consists of [one arbitrator / three arbitrators]. The language is English. The award is final and binding and may be enforced in any competent court under RA 9285 and RA 876 (Arbitration Law).]</w:t>
-      </w:r>
-    </w:p>
-    <w:p>
-      <w:pPr>
-        <w:pStyle w:val="Normal"/>
-        <w:spacing w:lineRule="auto" w:line="276" w:before="0" w:after="120"/>
-        <w:rPr/>
-      </w:pPr>
-      <w:r>
-        <w:rPr>
-          <w:rFonts w:eastAsia="Segoe UI" w:cs="Segoe UI" w:ascii="Segoe UI" w:hAnsi="Segoe UI"/>
-          <w:color w:val="101820"/>
-          <w:sz w:val="21"/>
-        </w:rPr>
-        <w:t>[Option B: Courts. If the dispute is not settled within 60 days of the start of mediation, it shall be submitted to the proper courts of [Makati City / Taguig City], Philippines, to the exclusion of all other venues.]</w:t>
-      </w:r>
-    </w:p>
-    <w:p>
-      <w:pPr>
-        <w:pStyle w:val="Heading2"/>
-        <w:rPr/>
-      </w:pPr>
-      <w:bookmarkStart w:id="62" w:name="__RefHeading___Toc1745_460044586"/>
-      <w:bookmarkEnd w:id="62"/>
-      <w:r>
-        <w:rPr>
-          <w:rFonts w:eastAsia="Segoe UI" w:cs="Segoe UI"/>
-          <w:b/>
-          <w:color w:val="0F4761"/>
-          <w:sz w:val="26"/>
-        </w:rPr>
-        <w:t>22.4  Interim relief and continued performance</w:t>
-      </w:r>
-    </w:p>
-    <w:p>
-      <w:pPr>
-        <w:pStyle w:val="Normal"/>
-        <w:spacing w:lineRule="auto" w:line="276" w:before="0" w:after="120"/>
-        <w:rPr/>
-      </w:pPr>
-      <w:r>
-        <w:rPr>
-          <w:rFonts w:eastAsia="Segoe UI" w:cs="Segoe UI" w:ascii="Segoe UI" w:hAnsi="Segoe UI"/>
-          <w:color w:val="101820"/>
-          <w:sz w:val="21"/>
-        </w:rPr>
-        <w:t>Nothing in this clause prevents a Party from seeking urgent interim relief from a competent court to protect its Confidential Information or Intellectual Property Rights. Unless the Agreement is terminated, the Parties continue to perform their obligations during the dispute, and iorta TechNXT does not suspend Services for an amount the Client disputes in good faith under the Fees and payment clause.</w:t>
-      </w:r>
-      <w:r>
-        <w:br w:type="page"/>
-      </w:r>
-    </w:p>
-    <w:p>
-      <w:pPr>
-        <w:pStyle w:val="Heading1"/>
-        <w:rPr/>
-      </w:pPr>
-      <w:bookmarkStart w:id="63" w:name="__RefHeading___Toc1747_460044586"/>
-      <w:bookmarkEnd w:id="63"/>
-      <w:r>
-        <w:rPr>
-          <w:rFonts w:eastAsia="Segoe UI" w:cs="Segoe UI" w:ascii="Segoe UI" w:hAnsi="Segoe UI"/>
-          <w:b/>
-          <w:color w:val="0F4761"/>
-          <w:sz w:val="32"/>
-        </w:rPr>
-        <w:t>23.  Governing law</w:t>
-      </w:r>
-    </w:p>
-    <w:p>
-      <w:pPr>
-        <w:pStyle w:val="Normal"/>
-        <w:spacing w:lineRule="auto" w:line="276" w:before="0" w:after="120"/>
-        <w:rPr/>
-      </w:pPr>
-      <w:r>
-        <w:rPr>
-          <w:rFonts w:eastAsia="Segoe UI" w:cs="Segoe UI" w:ascii="Segoe UI" w:hAnsi="Segoe UI"/>
-          <w:color w:val="101820"/>
-          <w:sz w:val="21"/>
-        </w:rPr>
-        <w:t>This Agreement and every Order Form are governed by and construed in accordance with the laws of the Republic of the Philippines.</w:t>
-      </w:r>
-      <w:r>
-        <w:br w:type="page"/>
-      </w:r>
-    </w:p>
-    <w:p>
-      <w:pPr>
-        <w:pStyle w:val="Heading1"/>
-        <w:rPr/>
-      </w:pPr>
-      <w:bookmarkStart w:id="64" w:name="__RefHeading___Toc1749_460044586"/>
-      <w:bookmarkEnd w:id="64"/>
-      <w:r>
-        <w:rPr>
-          <w:rFonts w:eastAsia="Segoe UI" w:cs="Segoe UI" w:ascii="Segoe UI" w:hAnsi="Segoe UI"/>
-          <w:b/>
-          <w:color w:val="0F4761"/>
-          <w:sz w:val="32"/>
-        </w:rPr>
-        <w:t>24.  Notices</w:t>
+        <w:t>11.6  Notices</w:t>
       </w:r>
     </w:p>
     <w:p>
@@ -10041,25 +9475,22 @@
       <w:r>
         <w:rPr/>
       </w:r>
-      <w:r>
-        <w:br w:type="page"/>
-      </w:r>
-    </w:p>
-    <w:p>
-      <w:pPr>
-        <w:pStyle w:val="Heading1"/>
-        <w:rPr/>
-      </w:pPr>
-      <w:bookmarkStart w:id="65" w:name="__RefHeading___Toc1751_460044586"/>
-      <w:bookmarkEnd w:id="65"/>
-      <w:r>
-        <w:rPr>
-          <w:rFonts w:eastAsia="Segoe UI" w:cs="Segoe UI" w:ascii="Segoe UI" w:hAnsi="Segoe UI"/>
+    </w:p>
+    <w:p>
+      <w:pPr>
+        <w:pStyle w:val="Heading2"/>
+        <w:rPr/>
+      </w:pPr>
+      <w:bookmarkStart w:id="39" w:name="__RefHeading___Toc3705_1603226370"/>
+      <w:bookmarkEnd w:id="39"/>
+      <w:r>
+        <w:rPr>
+          <w:rFonts w:eastAsia="Segoe UI" w:cs="Segoe UI"/>
           <w:b/>
           <w:color w:val="0F4761"/>
-          <w:sz w:val="32"/>
-        </w:rPr>
-        <w:t>25.  General</w:t>
+          <w:sz w:val="26"/>
+        </w:rPr>
+        <w:t>11.7  General</w:t>
       </w:r>
     </w:p>
     <w:p>
@@ -10350,8 +9781,8 @@
         <w:pStyle w:val="Heading1"/>
         <w:rPr/>
       </w:pPr>
-      <w:bookmarkStart w:id="66" w:name="__RefHeading___Toc1753_460044586"/>
-      <w:bookmarkEnd w:id="66"/>
+      <w:bookmarkStart w:id="40" w:name="__RefHeading___Toc3707_1603226370"/>
+      <w:bookmarkEnd w:id="40"/>
       <w:r>
         <w:rPr>
           <w:rFonts w:eastAsia="Segoe UI" w:cs="Segoe UI" w:ascii="Segoe UI" w:hAnsi="Segoe UI"/>
@@ -10359,7 +9790,24 @@
           <w:color w:val="0F4761"/>
           <w:sz w:val="32"/>
         </w:rPr>
-        <w:t>26.  Signatures</w:t>
+        <w:t>12.  Signatures</w:t>
+      </w:r>
+    </w:p>
+    <w:p>
+      <w:pPr>
+        <w:pStyle w:val="Heading2"/>
+        <w:rPr/>
+      </w:pPr>
+      <w:bookmarkStart w:id="41" w:name="__RefHeading___Toc3709_1603226370"/>
+      <w:bookmarkEnd w:id="41"/>
+      <w:r>
+        <w:rPr>
+          <w:rFonts w:eastAsia="Segoe UI" w:cs="Segoe UI"/>
+          <w:b/>
+          <w:color w:val="0F4761"/>
+          <w:sz w:val="26"/>
+        </w:rPr>
+        <w:t>12.1  Signature blocks</w:t>
       </w:r>
     </w:p>
     <w:p>
@@ -10874,25 +10322,22 @@
       <w:r>
         <w:rPr/>
       </w:r>
-      <w:r>
-        <w:br w:type="page"/>
-      </w:r>
-    </w:p>
-    <w:p>
-      <w:pPr>
-        <w:pStyle w:val="Heading1"/>
-        <w:rPr/>
-      </w:pPr>
-      <w:bookmarkStart w:id="67" w:name="__RefHeading___Toc1755_460044586"/>
-      <w:bookmarkEnd w:id="67"/>
-      <w:r>
-        <w:rPr>
-          <w:rFonts w:eastAsia="Segoe UI" w:cs="Segoe UI" w:ascii="Segoe UI" w:hAnsi="Segoe UI"/>
+    </w:p>
+    <w:p>
+      <w:pPr>
+        <w:pStyle w:val="Heading2"/>
+        <w:rPr/>
+      </w:pPr>
+      <w:bookmarkStart w:id="42" w:name="__RefHeading___Toc3711_1603226370"/>
+      <w:bookmarkEnd w:id="42"/>
+      <w:r>
+        <w:rPr>
+          <w:rFonts w:eastAsia="Segoe UI" w:cs="Segoe UI"/>
           <w:b/>
           <w:color w:val="0F4761"/>
-          <w:sz w:val="32"/>
-        </w:rPr>
-        <w:t>27.  Acknowledgment</w:t>
+          <w:sz w:val="26"/>
+        </w:rPr>
+        <w:t>12.2  Acknowledgment</w:t>
       </w:r>
     </w:p>
     <w:p>
@@ -11389,8 +10834,8 @@
         <w:pStyle w:val="Heading1"/>
         <w:rPr/>
       </w:pPr>
-      <w:bookmarkStart w:id="68" w:name="__RefHeading___Toc1757_460044586"/>
-      <w:bookmarkEnd w:id="68"/>
+      <w:bookmarkStart w:id="43" w:name="__RefHeading___Toc3713_1603226370"/>
+      <w:bookmarkEnd w:id="43"/>
       <w:r>
         <w:rPr>
           <w:rFonts w:eastAsia="Segoe UI" w:cs="Segoe UI" w:ascii="Segoe UI" w:hAnsi="Segoe UI"/>
@@ -11398,7 +10843,7 @@
           <w:color w:val="0F4761"/>
           <w:sz w:val="32"/>
         </w:rPr>
-        <w:t>28.  Annex A: schedules and forms</w:t>
+        <w:t>13.  Annex A: schedules and forms</w:t>
       </w:r>
     </w:p>
     <w:tbl>
@@ -12306,9 +11751,9 @@
           <w:spacing w:val="0"/>
         </w:rPr>
       </w:pPr>
-      <w:bookmarkStart w:id="69" w:name="__RefHeading___Toc1759_460044586"/>
-      <w:bookmarkStart w:id="70" w:name="_Toc233203395"/>
-      <w:bookmarkEnd w:id="69"/>
+      <w:bookmarkStart w:id="44" w:name="__RefHeading___Toc3715_1603226370"/>
+      <w:bookmarkStart w:id="45" w:name="_Toc233203395"/>
+      <w:bookmarkEnd w:id="44"/>
       <w:r>
         <w:rPr>
           <w:rStyle w:val="BookTitle"/>
@@ -12317,9 +11762,9 @@
           <w:iCs w:val="false"/>
           <w:spacing w:val="0"/>
         </w:rPr>
-        <w:t>29.  Document Sign-Off</w:t>
-      </w:r>
-      <w:bookmarkEnd w:id="70"/>
+        <w:t>14.  Document Sign-Off</w:t>
+      </w:r>
+      <w:bookmarkEnd w:id="45"/>
     </w:p>
     <w:p>
       <w:pPr>
@@ -14078,7 +13523,7 @@
       <w:r>
         <w:rPr/>
         <w:drawing>
-          <wp:anchor behindDoc="1" distT="0" distB="0" distL="0" distR="0" simplePos="0" locked="0" layoutInCell="0" allowOverlap="1" relativeHeight="36">
+          <wp:anchor behindDoc="1" distT="0" distB="0" distL="0" distR="0" simplePos="0" locked="0" layoutInCell="0" allowOverlap="1" relativeHeight="27">
             <wp:simplePos x="0" y="0"/>
             <wp:positionH relativeFrom="margin">
               <wp:align>center</wp:align>
@@ -14149,7 +13594,7 @@
     <w:r>
       <w:rPr/>
       <w:drawing>
-        <wp:anchor behindDoc="1" distT="0" distB="0" distL="0" distR="0" simplePos="0" locked="0" layoutInCell="0" allowOverlap="1" relativeHeight="35">
+        <wp:anchor behindDoc="1" distT="0" distB="0" distL="0" distR="0" simplePos="0" locked="0" layoutInCell="0" allowOverlap="1" relativeHeight="26">
           <wp:simplePos x="0" y="0"/>
           <wp:positionH relativeFrom="page">
             <wp:align>left</wp:align>
@@ -14208,7 +13653,7 @@
     <w:r>
       <w:rPr/>
       <w:drawing>
-        <wp:anchor behindDoc="1" distT="0" distB="0" distL="0" distR="0" simplePos="0" locked="0" layoutInCell="0" allowOverlap="1" relativeHeight="35">
+        <wp:anchor behindDoc="1" distT="0" distB="0" distL="0" distR="0" simplePos="0" locked="0" layoutInCell="0" allowOverlap="1" relativeHeight="26">
           <wp:simplePos x="0" y="0"/>
           <wp:positionH relativeFrom="page">
             <wp:align>left</wp:align>

</xml_diff>